<commit_message>
Correccion de Informe y Entrega Final
</commit_message>
<xml_diff>
--- a/1ER_CORTE/3_Algoritmo_De_Generación_De_Numeros_Pseudoaleatorios/Proyecto/Informe_No_3_Num_PseudoA.docx
+++ b/1ER_CORTE/3_Algoritmo_De_Generación_De_Numeros_Pseudoaleatorios/Proyecto/Informe_No_3_Num_PseudoA.docx
@@ -25,8 +25,9 @@
           <w:lang w:eastAsia="es-CO"/>
           <w14:ligatures w14:val="standardContextual"/>
         </w:rPr>
-        <w:t xml:space="preserve">Algoritmo de </w:t>
-      </w:r>
+        <w:t xml:space="preserve">Algoritmo de Generación de </w:t>
+      </w:r>
+      <w:proofErr w:type="spellStart"/>
       <w:r>
         <w:rPr>
           <w:rFonts w:ascii="Times New Roman" w:eastAsia="Arial" w:hAnsi="Times New Roman" w:cs="Times New Roman"/>
@@ -36,8 +37,9 @@
           <w:lang w:eastAsia="es-CO"/>
           <w14:ligatures w14:val="standardContextual"/>
         </w:rPr>
-        <w:t>G</w:t>
-      </w:r>
+        <w:t>Numeros</w:t>
+      </w:r>
+      <w:proofErr w:type="spellEnd"/>
       <w:r>
         <w:rPr>
           <w:rFonts w:ascii="Times New Roman" w:eastAsia="Arial" w:hAnsi="Times New Roman" w:cs="Times New Roman"/>
@@ -47,70 +49,79 @@
           <w:lang w:eastAsia="es-CO"/>
           <w14:ligatures w14:val="standardContextual"/>
         </w:rPr>
-        <w:t xml:space="preserve">eneración de </w:t>
-      </w:r>
-      <w:proofErr w:type="spellStart"/>
-      <w:r>
+        <w:t xml:space="preserve"> Pseudoaleatorios</w:t>
+      </w:r>
+    </w:p>
+    <w:p>
+      <w:pPr>
+        <w:spacing w:line="360" w:lineRule="auto"/>
+        <w:ind w:left="10" w:right="47" w:hanging="10"/>
+        <w:jc w:val="center"/>
         <w:rPr>
           <w:rFonts w:ascii="Times New Roman" w:eastAsia="Arial" w:hAnsi="Times New Roman" w:cs="Times New Roman"/>
           <w:b/>
-          <w:bCs/>
           <w:kern w:val="2"/>
           <w:lang w:eastAsia="es-CO"/>
           <w14:ligatures w14:val="standardContextual"/>
         </w:rPr>
-        <w:t>N</w:t>
-      </w:r>
+      </w:pPr>
       <w:r>
         <w:rPr>
           <w:rFonts w:ascii="Times New Roman" w:eastAsia="Arial" w:hAnsi="Times New Roman" w:cs="Times New Roman"/>
           <w:b/>
-          <w:bCs/>
           <w:kern w:val="2"/>
           <w:lang w:eastAsia="es-CO"/>
           <w14:ligatures w14:val="standardContextual"/>
         </w:rPr>
-        <w:t>umeros</w:t>
-      </w:r>
-      <w:proofErr w:type="spellEnd"/>
-      <w:r>
+        <w:t>Informe</w:t>
+      </w:r>
+    </w:p>
+    <w:p>
+      <w:pPr>
+        <w:spacing w:line="360" w:lineRule="auto"/>
+        <w:ind w:left="35"/>
+        <w:jc w:val="center"/>
         <w:rPr>
           <w:rFonts w:ascii="Times New Roman" w:eastAsia="Arial" w:hAnsi="Times New Roman" w:cs="Times New Roman"/>
           <w:b/>
-          <w:bCs/>
           <w:kern w:val="2"/>
           <w:lang w:eastAsia="es-CO"/>
           <w14:ligatures w14:val="standardContextual"/>
         </w:rPr>
-        <w:t xml:space="preserve"> </w:t>
-      </w:r>
-      <w:r>
+      </w:pPr>
+    </w:p>
+    <w:p>
+      <w:pPr>
+        <w:spacing w:line="360" w:lineRule="auto"/>
+        <w:ind w:left="35"/>
+        <w:jc w:val="center"/>
         <w:rPr>
           <w:rFonts w:ascii="Times New Roman" w:eastAsia="Arial" w:hAnsi="Times New Roman" w:cs="Times New Roman"/>
           <w:b/>
-          <w:bCs/>
           <w:kern w:val="2"/>
           <w:lang w:eastAsia="es-CO"/>
           <w14:ligatures w14:val="standardContextual"/>
         </w:rPr>
-        <w:t>P</w:t>
-      </w:r>
-      <w:r>
+      </w:pPr>
+    </w:p>
+    <w:p>
+      <w:pPr>
+        <w:spacing w:line="360" w:lineRule="auto"/>
+        <w:ind w:left="35"/>
+        <w:jc w:val="center"/>
         <w:rPr>
           <w:rFonts w:ascii="Times New Roman" w:eastAsia="Arial" w:hAnsi="Times New Roman" w:cs="Times New Roman"/>
           <w:b/>
-          <w:bCs/>
           <w:kern w:val="2"/>
           <w:lang w:eastAsia="es-CO"/>
           <w14:ligatures w14:val="standardContextual"/>
         </w:rPr>
-        <w:t>seudoaleatorios</w:t>
-      </w:r>
+      </w:pPr>
     </w:p>
     <w:p>
       <w:pPr>
         <w:spacing w:line="360" w:lineRule="auto"/>
-        <w:ind w:left="10" w:right="47" w:hanging="10"/>
+        <w:ind w:left="35"/>
         <w:jc w:val="center"/>
         <w:rPr>
           <w:rFonts w:ascii="Times New Roman" w:eastAsia="Arial" w:hAnsi="Times New Roman" w:cs="Times New Roman"/>
@@ -120,7 +131,12 @@
           <w14:ligatures w14:val="standardContextual"/>
         </w:rPr>
       </w:pPr>
-      <w:r>
+    </w:p>
+    <w:p>
+      <w:pPr>
+        <w:spacing w:line="360" w:lineRule="auto"/>
+        <w:ind w:left="35"/>
+        <w:jc w:val="center"/>
         <w:rPr>
           <w:rFonts w:ascii="Times New Roman" w:eastAsia="Arial" w:hAnsi="Times New Roman" w:cs="Times New Roman"/>
           <w:b/>
@@ -128,8 +144,7 @@
           <w:lang w:eastAsia="es-CO"/>
           <w14:ligatures w14:val="standardContextual"/>
         </w:rPr>
-        <w:t>Informe</w:t>
-      </w:r>
+      </w:pPr>
     </w:p>
     <w:p>
       <w:pPr>
@@ -137,120 +152,76 @@
         <w:ind w:left="35"/>
         <w:jc w:val="center"/>
         <w:rPr>
+          <w:rFonts w:ascii="Times New Roman" w:hAnsi="Times New Roman" w:cs="Times New Roman"/>
+        </w:rPr>
+      </w:pPr>
+      <w:r>
+        <w:rPr>
+          <w:rFonts w:ascii="Times New Roman" w:eastAsia="Arial" w:hAnsi="Times New Roman" w:cs="Times New Roman"/>
+          <w:b/>
+          <w:bCs/>
+          <w:lang w:eastAsia="es-CO"/>
+        </w:rPr>
+        <w:t>Juan David Romero Morales – 20222020102</w:t>
+      </w:r>
+    </w:p>
+    <w:p>
+      <w:pPr>
+        <w:spacing w:line="360" w:lineRule="auto"/>
+        <w:ind w:left="35"/>
+        <w:jc w:val="center"/>
+        <w:rPr>
+          <w:rFonts w:ascii="Times New Roman" w:hAnsi="Times New Roman" w:cs="Times New Roman"/>
+        </w:rPr>
+      </w:pPr>
+      <w:r>
+        <w:rPr>
+          <w:rFonts w:ascii="Times New Roman" w:eastAsia="Arial" w:hAnsi="Times New Roman" w:cs="Times New Roman"/>
+          <w:b/>
+          <w:bCs/>
+          <w:lang w:eastAsia="es-CO"/>
+        </w:rPr>
+        <w:t xml:space="preserve">Jaider Alejandro </w:t>
+      </w:r>
+      <w:proofErr w:type="spellStart"/>
+      <w:r>
+        <w:rPr>
+          <w:rFonts w:ascii="Times New Roman" w:eastAsia="Arial" w:hAnsi="Times New Roman" w:cs="Times New Roman"/>
+          <w:b/>
+          <w:bCs/>
+          <w:lang w:eastAsia="es-CO"/>
+        </w:rPr>
+        <w:t>Gonzalez</w:t>
+      </w:r>
+      <w:proofErr w:type="spellEnd"/>
+      <w:r>
+        <w:rPr>
+          <w:rFonts w:ascii="Times New Roman" w:eastAsia="Arial" w:hAnsi="Times New Roman" w:cs="Times New Roman"/>
+          <w:b/>
+          <w:bCs/>
+          <w:lang w:eastAsia="es-CO"/>
+        </w:rPr>
+        <w:t xml:space="preserve"> Rojas - 20242020075</w:t>
+      </w:r>
+    </w:p>
+    <w:p>
+      <w:pPr>
+        <w:spacing w:line="360" w:lineRule="auto"/>
+        <w:ind w:left="10" w:right="41" w:hanging="10"/>
+        <w:jc w:val="center"/>
+        <w:rPr>
+          <w:rFonts w:ascii="Times New Roman" w:hAnsi="Times New Roman" w:cs="Times New Roman"/>
+        </w:rPr>
+      </w:pPr>
+      <w:r>
+        <w:rPr>
           <w:rFonts w:ascii="Times New Roman" w:eastAsia="Arial" w:hAnsi="Times New Roman" w:cs="Times New Roman"/>
           <w:b/>
           <w:kern w:val="2"/>
           <w:lang w:eastAsia="es-CO"/>
           <w14:ligatures w14:val="standardContextual"/>
         </w:rPr>
-      </w:pPr>
-    </w:p>
-    <w:p>
-      <w:pPr>
-        <w:spacing w:line="360" w:lineRule="auto"/>
-        <w:ind w:left="35"/>
-        <w:jc w:val="center"/>
-        <w:rPr>
-          <w:rFonts w:ascii="Times New Roman" w:eastAsia="Arial" w:hAnsi="Times New Roman" w:cs="Times New Roman"/>
-          <w:b/>
-          <w:kern w:val="2"/>
-          <w:lang w:eastAsia="es-CO"/>
-          <w14:ligatures w14:val="standardContextual"/>
-        </w:rPr>
-      </w:pPr>
-    </w:p>
-    <w:p>
-      <w:pPr>
-        <w:spacing w:line="360" w:lineRule="auto"/>
-        <w:ind w:left="35"/>
-        <w:jc w:val="center"/>
-        <w:rPr>
-          <w:rFonts w:ascii="Times New Roman" w:eastAsia="Arial" w:hAnsi="Times New Roman" w:cs="Times New Roman"/>
-          <w:b/>
-          <w:kern w:val="2"/>
-          <w:lang w:eastAsia="es-CO"/>
-          <w14:ligatures w14:val="standardContextual"/>
-        </w:rPr>
-      </w:pPr>
-    </w:p>
-    <w:p>
-      <w:pPr>
-        <w:spacing w:line="360" w:lineRule="auto"/>
-        <w:ind w:left="35"/>
-        <w:jc w:val="center"/>
-        <w:rPr>
-          <w:rFonts w:ascii="Times New Roman" w:eastAsia="Arial" w:hAnsi="Times New Roman" w:cs="Times New Roman"/>
-          <w:b/>
-          <w:kern w:val="2"/>
-          <w:lang w:eastAsia="es-CO"/>
-          <w14:ligatures w14:val="standardContextual"/>
-        </w:rPr>
-      </w:pPr>
-    </w:p>
-    <w:p>
-      <w:pPr>
-        <w:spacing w:line="360" w:lineRule="auto"/>
-        <w:ind w:left="35"/>
-        <w:jc w:val="center"/>
-        <w:rPr>
-          <w:rFonts w:ascii="Times New Roman" w:eastAsia="Arial" w:hAnsi="Times New Roman" w:cs="Times New Roman"/>
-          <w:b/>
-          <w:kern w:val="2"/>
-          <w:lang w:eastAsia="es-CO"/>
-          <w14:ligatures w14:val="standardContextual"/>
-        </w:rPr>
-      </w:pPr>
-    </w:p>
-    <w:p>
-      <w:pPr>
-        <w:spacing w:line="360" w:lineRule="auto"/>
-        <w:ind w:left="35"/>
-        <w:jc w:val="center"/>
-      </w:pPr>
-      <w:r>
-        <w:rPr>
-          <w:rFonts w:ascii="Times New Roman" w:eastAsia="Arial" w:hAnsi="Times New Roman" w:cs="Times New Roman"/>
-          <w:b/>
-          <w:bCs/>
-          <w:lang w:eastAsia="es-CO"/>
-        </w:rPr>
-        <w:t>Juan David Romero Morales – 20222020102</w:t>
-      </w:r>
-    </w:p>
-    <w:p>
-      <w:pPr>
-        <w:spacing w:line="360" w:lineRule="auto"/>
-        <w:ind w:left="35"/>
-        <w:jc w:val="center"/>
-      </w:pPr>
-      <w:r>
-        <w:rPr>
-          <w:rFonts w:ascii="Times New Roman" w:eastAsia="Arial" w:hAnsi="Times New Roman" w:cs="Times New Roman"/>
-          <w:b/>
-          <w:bCs/>
-          <w:lang w:eastAsia="es-CO"/>
-        </w:rPr>
-        <w:t xml:space="preserve">Jaider Alejandro </w:t>
-      </w:r>
-      <w:proofErr w:type="spellStart"/>
-      <w:r>
-        <w:rPr>
-          <w:rFonts w:ascii="Times New Roman" w:eastAsia="Arial" w:hAnsi="Times New Roman" w:cs="Times New Roman"/>
-          <w:b/>
-          <w:bCs/>
-          <w:lang w:eastAsia="es-CO"/>
-        </w:rPr>
-        <w:t>Gonzalez</w:t>
-      </w:r>
-      <w:proofErr w:type="spellEnd"/>
-      <w:r>
-        <w:rPr>
-          <w:rFonts w:ascii="Times New Roman" w:eastAsia="Arial" w:hAnsi="Times New Roman" w:cs="Times New Roman"/>
-          <w:b/>
-          <w:bCs/>
-          <w:lang w:eastAsia="es-CO"/>
-        </w:rPr>
-        <w:t xml:space="preserve"> Rojas - 20242020075</w:t>
+        <w:t>Jimmy Alejandro Granados Becerra - 20251020034</w:t>
       </w:r>
     </w:p>
     <w:p>
@@ -258,23 +229,9 @@
         <w:spacing w:line="360" w:lineRule="auto"/>
         <w:ind w:left="10" w:right="41" w:hanging="10"/>
         <w:jc w:val="center"/>
-      </w:pPr>
-      <w:r>
-        <w:rPr>
-          <w:rFonts w:ascii="Times New Roman" w:eastAsia="Arial" w:hAnsi="Times New Roman" w:cs="Times New Roman"/>
-          <w:b/>
-          <w:kern w:val="2"/>
-          <w:lang w:eastAsia="es-CO"/>
-          <w14:ligatures w14:val="standardContextual"/>
-        </w:rPr>
-        <w:t>Jimmy Alejandro Granados Becerra - 20251020034</w:t>
-      </w:r>
-    </w:p>
-    <w:p>
-      <w:pPr>
-        <w:spacing w:line="360" w:lineRule="auto"/>
-        <w:ind w:left="10" w:right="41" w:hanging="10"/>
-        <w:jc w:val="center"/>
+        <w:rPr>
+          <w:rFonts w:ascii="Times New Roman" w:hAnsi="Times New Roman" w:cs="Times New Roman"/>
+        </w:rPr>
       </w:pPr>
       <w:r>
         <w:rPr>
@@ -768,10 +725,12 @@
         </w:tabs>
         <w:spacing w:line="360" w:lineRule="auto"/>
         <w:rPr>
-          <w:rFonts w:asciiTheme="minorHAnsi" w:eastAsiaTheme="minorEastAsia" w:hAnsiTheme="minorHAnsi"/>
+          <w:rFonts w:eastAsiaTheme="minorEastAsia" w:cs="Times New Roman"/>
           <w:b w:val="0"/>
           <w:noProof/>
           <w:kern w:val="2"/>
+          <w:sz w:val="22"/>
+          <w:szCs w:val="22"/>
           <w:lang w:val="es-CO" w:eastAsia="es-CO"/>
           <w14:ligatures w14:val="standardContextual"/>
         </w:rPr>
@@ -812,15 +771,19 @@
             <w:rStyle w:val="Hipervnculo"/>
             <w:rFonts w:eastAsia="Arial" w:cs="Times New Roman"/>
             <w:noProof/>
+            <w:sz w:val="22"/>
+            <w:szCs w:val="22"/>
           </w:rPr>
           <w:t>1.</w:t>
         </w:r>
         <w:r>
           <w:rPr>
-            <w:rFonts w:asciiTheme="minorHAnsi" w:eastAsiaTheme="minorEastAsia" w:hAnsiTheme="minorHAnsi"/>
+            <w:rFonts w:eastAsiaTheme="minorEastAsia" w:cs="Times New Roman"/>
             <w:b w:val="0"/>
             <w:noProof/>
             <w:kern w:val="2"/>
+            <w:sz w:val="22"/>
+            <w:szCs w:val="22"/>
             <w:lang w:val="es-CO" w:eastAsia="es-CO"/>
             <w14:ligatures w14:val="standardContextual"/>
           </w:rPr>
@@ -831,54 +794,77 @@
             <w:rStyle w:val="Hipervnculo"/>
             <w:rFonts w:eastAsia="Arial" w:cs="Times New Roman"/>
             <w:noProof/>
+            <w:sz w:val="22"/>
+            <w:szCs w:val="22"/>
           </w:rPr>
           <w:t>Introducción</w:t>
         </w:r>
         <w:r>
           <w:rPr>
+            <w:rFonts w:cs="Times New Roman"/>
             <w:noProof/>
             <w:webHidden/>
+            <w:sz w:val="22"/>
+            <w:szCs w:val="22"/>
           </w:rPr>
           <w:tab/>
         </w:r>
         <w:r>
           <w:rPr>
+            <w:rFonts w:cs="Times New Roman"/>
             <w:noProof/>
             <w:webHidden/>
+            <w:sz w:val="22"/>
+            <w:szCs w:val="22"/>
           </w:rPr>
           <w:fldChar w:fldCharType="begin"/>
         </w:r>
         <w:r>
           <w:rPr>
+            <w:rFonts w:cs="Times New Roman"/>
             <w:noProof/>
             <w:webHidden/>
+            <w:sz w:val="22"/>
+            <w:szCs w:val="22"/>
           </w:rPr>
           <w:instrText xml:space="preserve"> PAGEREF _Toc238837451 \h </w:instrText>
         </w:r>
         <w:r>
           <w:rPr>
+            <w:rFonts w:cs="Times New Roman"/>
             <w:noProof/>
             <w:webHidden/>
+            <w:sz w:val="22"/>
+            <w:szCs w:val="22"/>
           </w:rPr>
         </w:r>
         <w:r>
           <w:rPr>
+            <w:rFonts w:cs="Times New Roman"/>
             <w:noProof/>
             <w:webHidden/>
+            <w:sz w:val="22"/>
+            <w:szCs w:val="22"/>
           </w:rPr>
           <w:fldChar w:fldCharType="separate"/>
         </w:r>
         <w:r>
           <w:rPr>
+            <w:rFonts w:cs="Times New Roman"/>
             <w:noProof/>
             <w:webHidden/>
+            <w:sz w:val="22"/>
+            <w:szCs w:val="22"/>
           </w:rPr>
           <w:t>3</w:t>
         </w:r>
         <w:r>
           <w:rPr>
+            <w:rFonts w:cs="Times New Roman"/>
             <w:noProof/>
             <w:webHidden/>
+            <w:sz w:val="22"/>
+            <w:szCs w:val="22"/>
           </w:rPr>
           <w:fldChar w:fldCharType="end"/>
         </w:r>
@@ -893,10 +879,12 @@
         </w:tabs>
         <w:spacing w:line="360" w:lineRule="auto"/>
         <w:rPr>
-          <w:rFonts w:asciiTheme="minorHAnsi" w:eastAsiaTheme="minorEastAsia" w:hAnsiTheme="minorHAnsi"/>
+          <w:rFonts w:eastAsiaTheme="minorEastAsia" w:cs="Times New Roman"/>
           <w:b w:val="0"/>
           <w:noProof/>
           <w:kern w:val="2"/>
+          <w:sz w:val="22"/>
+          <w:szCs w:val="22"/>
           <w:lang w:val="es-CO" w:eastAsia="es-CO"/>
           <w14:ligatures w14:val="standardContextual"/>
         </w:rPr>
@@ -907,15 +895,19 @@
             <w:rStyle w:val="Hipervnculo"/>
             <w:rFonts w:eastAsia="Times New Roman" w:cs="Times New Roman"/>
             <w:noProof/>
+            <w:sz w:val="22"/>
+            <w:szCs w:val="22"/>
           </w:rPr>
           <w:t>2.</w:t>
         </w:r>
         <w:r>
           <w:rPr>
-            <w:rFonts w:asciiTheme="minorHAnsi" w:eastAsiaTheme="minorEastAsia" w:hAnsiTheme="minorHAnsi"/>
+            <w:rFonts w:eastAsiaTheme="minorEastAsia" w:cs="Times New Roman"/>
             <w:b w:val="0"/>
             <w:noProof/>
             <w:kern w:val="2"/>
+            <w:sz w:val="22"/>
+            <w:szCs w:val="22"/>
             <w:lang w:val="es-CO" w:eastAsia="es-CO"/>
             <w14:ligatures w14:val="standardContextual"/>
           </w:rPr>
@@ -926,54 +918,77 @@
             <w:rStyle w:val="Hipervnculo"/>
             <w:rFonts w:eastAsia="Times New Roman" w:cs="Times New Roman"/>
             <w:noProof/>
+            <w:sz w:val="22"/>
+            <w:szCs w:val="22"/>
           </w:rPr>
           <w:t>Objetivos</w:t>
         </w:r>
         <w:r>
           <w:rPr>
+            <w:rFonts w:cs="Times New Roman"/>
             <w:noProof/>
             <w:webHidden/>
+            <w:sz w:val="22"/>
+            <w:szCs w:val="22"/>
           </w:rPr>
           <w:tab/>
         </w:r>
         <w:r>
           <w:rPr>
+            <w:rFonts w:cs="Times New Roman"/>
             <w:noProof/>
             <w:webHidden/>
+            <w:sz w:val="22"/>
+            <w:szCs w:val="22"/>
           </w:rPr>
           <w:fldChar w:fldCharType="begin"/>
         </w:r>
         <w:r>
           <w:rPr>
+            <w:rFonts w:cs="Times New Roman"/>
             <w:noProof/>
             <w:webHidden/>
+            <w:sz w:val="22"/>
+            <w:szCs w:val="22"/>
           </w:rPr>
           <w:instrText xml:space="preserve"> PAGEREF _Toc238837452 \h </w:instrText>
         </w:r>
         <w:r>
           <w:rPr>
+            <w:rFonts w:cs="Times New Roman"/>
             <w:noProof/>
             <w:webHidden/>
+            <w:sz w:val="22"/>
+            <w:szCs w:val="22"/>
           </w:rPr>
         </w:r>
         <w:r>
           <w:rPr>
+            <w:rFonts w:cs="Times New Roman"/>
             <w:noProof/>
             <w:webHidden/>
+            <w:sz w:val="22"/>
+            <w:szCs w:val="22"/>
           </w:rPr>
           <w:fldChar w:fldCharType="separate"/>
         </w:r>
         <w:r>
           <w:rPr>
+            <w:rFonts w:cs="Times New Roman"/>
             <w:noProof/>
             <w:webHidden/>
+            <w:sz w:val="22"/>
+            <w:szCs w:val="22"/>
           </w:rPr>
           <w:t>4</w:t>
         </w:r>
         <w:r>
           <w:rPr>
+            <w:rFonts w:cs="Times New Roman"/>
             <w:noProof/>
             <w:webHidden/>
+            <w:sz w:val="22"/>
+            <w:szCs w:val="22"/>
           </w:rPr>
           <w:fldChar w:fldCharType="end"/>
         </w:r>
@@ -988,11 +1003,13 @@
         </w:tabs>
         <w:spacing w:line="360" w:lineRule="auto"/>
         <w:rPr>
-          <w:rFonts w:asciiTheme="minorHAnsi" w:eastAsiaTheme="minorEastAsia" w:hAnsiTheme="minorHAnsi"/>
+          <w:rFonts w:eastAsiaTheme="minorEastAsia" w:cs="Times New Roman"/>
           <w:b w:val="0"/>
           <w:noProof/>
           <w:color w:val="auto"/>
           <w:kern w:val="2"/>
+          <w:sz w:val="22"/>
+          <w:szCs w:val="22"/>
           <w:lang w:val="es-CO" w:eastAsia="es-CO"/>
           <w14:ligatures w14:val="standardContextual"/>
         </w:rPr>
@@ -1003,16 +1020,20 @@
             <w:rStyle w:val="Hipervnculo"/>
             <w:rFonts w:eastAsia="Arial" w:cs="Times New Roman"/>
             <w:noProof/>
+            <w:sz w:val="22"/>
+            <w:szCs w:val="22"/>
           </w:rPr>
           <w:t>2.1.</w:t>
         </w:r>
         <w:r>
           <w:rPr>
-            <w:rFonts w:asciiTheme="minorHAnsi" w:eastAsiaTheme="minorEastAsia" w:hAnsiTheme="minorHAnsi"/>
+            <w:rFonts w:eastAsiaTheme="minorEastAsia" w:cs="Times New Roman"/>
             <w:b w:val="0"/>
             <w:noProof/>
             <w:color w:val="auto"/>
             <w:kern w:val="2"/>
+            <w:sz w:val="22"/>
+            <w:szCs w:val="22"/>
             <w:lang w:val="es-CO" w:eastAsia="es-CO"/>
             <w14:ligatures w14:val="standardContextual"/>
           </w:rPr>
@@ -1023,54 +1044,77 @@
             <w:rStyle w:val="Hipervnculo"/>
             <w:rFonts w:eastAsia="Arial" w:cs="Times New Roman"/>
             <w:noProof/>
+            <w:sz w:val="22"/>
+            <w:szCs w:val="22"/>
           </w:rPr>
           <w:t>Objetivo General</w:t>
         </w:r>
         <w:r>
           <w:rPr>
+            <w:rFonts w:cs="Times New Roman"/>
             <w:noProof/>
             <w:webHidden/>
+            <w:sz w:val="22"/>
+            <w:szCs w:val="22"/>
           </w:rPr>
           <w:tab/>
         </w:r>
         <w:r>
           <w:rPr>
+            <w:rFonts w:cs="Times New Roman"/>
             <w:noProof/>
             <w:webHidden/>
+            <w:sz w:val="22"/>
+            <w:szCs w:val="22"/>
           </w:rPr>
           <w:fldChar w:fldCharType="begin"/>
         </w:r>
         <w:r>
           <w:rPr>
+            <w:rFonts w:cs="Times New Roman"/>
             <w:noProof/>
             <w:webHidden/>
+            <w:sz w:val="22"/>
+            <w:szCs w:val="22"/>
           </w:rPr>
           <w:instrText xml:space="preserve"> PAGEREF _Toc238837453 \h </w:instrText>
         </w:r>
         <w:r>
           <w:rPr>
+            <w:rFonts w:cs="Times New Roman"/>
             <w:noProof/>
             <w:webHidden/>
+            <w:sz w:val="22"/>
+            <w:szCs w:val="22"/>
           </w:rPr>
         </w:r>
         <w:r>
           <w:rPr>
+            <w:rFonts w:cs="Times New Roman"/>
             <w:noProof/>
             <w:webHidden/>
+            <w:sz w:val="22"/>
+            <w:szCs w:val="22"/>
           </w:rPr>
           <w:fldChar w:fldCharType="separate"/>
         </w:r>
         <w:r>
           <w:rPr>
+            <w:rFonts w:cs="Times New Roman"/>
             <w:noProof/>
             <w:webHidden/>
+            <w:sz w:val="22"/>
+            <w:szCs w:val="22"/>
           </w:rPr>
           <w:t>4</w:t>
         </w:r>
         <w:r>
           <w:rPr>
+            <w:rFonts w:cs="Times New Roman"/>
             <w:noProof/>
             <w:webHidden/>
+            <w:sz w:val="22"/>
+            <w:szCs w:val="22"/>
           </w:rPr>
           <w:fldChar w:fldCharType="end"/>
         </w:r>
@@ -1085,11 +1129,13 @@
         </w:tabs>
         <w:spacing w:line="360" w:lineRule="auto"/>
         <w:rPr>
-          <w:rFonts w:asciiTheme="minorHAnsi" w:eastAsiaTheme="minorEastAsia" w:hAnsiTheme="minorHAnsi"/>
+          <w:rFonts w:eastAsiaTheme="minorEastAsia" w:cs="Times New Roman"/>
           <w:b w:val="0"/>
           <w:noProof/>
           <w:color w:val="auto"/>
           <w:kern w:val="2"/>
+          <w:sz w:val="22"/>
+          <w:szCs w:val="22"/>
           <w:lang w:val="es-CO" w:eastAsia="es-CO"/>
           <w14:ligatures w14:val="standardContextual"/>
         </w:rPr>
@@ -1100,16 +1146,20 @@
             <w:rStyle w:val="Hipervnculo"/>
             <w:rFonts w:eastAsia="Arial" w:cs="Times New Roman"/>
             <w:noProof/>
+            <w:sz w:val="22"/>
+            <w:szCs w:val="22"/>
           </w:rPr>
           <w:t>2.2.</w:t>
         </w:r>
         <w:r>
           <w:rPr>
-            <w:rFonts w:asciiTheme="minorHAnsi" w:eastAsiaTheme="minorEastAsia" w:hAnsiTheme="minorHAnsi"/>
+            <w:rFonts w:eastAsiaTheme="minorEastAsia" w:cs="Times New Roman"/>
             <w:b w:val="0"/>
             <w:noProof/>
             <w:color w:val="auto"/>
             <w:kern w:val="2"/>
+            <w:sz w:val="22"/>
+            <w:szCs w:val="22"/>
             <w:lang w:val="es-CO" w:eastAsia="es-CO"/>
             <w14:ligatures w14:val="standardContextual"/>
           </w:rPr>
@@ -1121,54 +1171,77 @@
             <w:rFonts w:eastAsia="Arial" w:cs="Times New Roman"/>
             <w:bCs/>
             <w:noProof/>
+            <w:sz w:val="22"/>
+            <w:szCs w:val="22"/>
           </w:rPr>
           <w:t>Objetivos Específicos</w:t>
         </w:r>
         <w:r>
           <w:rPr>
+            <w:rFonts w:cs="Times New Roman"/>
             <w:noProof/>
             <w:webHidden/>
+            <w:sz w:val="22"/>
+            <w:szCs w:val="22"/>
           </w:rPr>
           <w:tab/>
         </w:r>
         <w:r>
           <w:rPr>
+            <w:rFonts w:cs="Times New Roman"/>
             <w:noProof/>
             <w:webHidden/>
+            <w:sz w:val="22"/>
+            <w:szCs w:val="22"/>
           </w:rPr>
           <w:fldChar w:fldCharType="begin"/>
         </w:r>
         <w:r>
           <w:rPr>
+            <w:rFonts w:cs="Times New Roman"/>
             <w:noProof/>
             <w:webHidden/>
+            <w:sz w:val="22"/>
+            <w:szCs w:val="22"/>
           </w:rPr>
           <w:instrText xml:space="preserve"> PAGEREF _Toc238837454 \h </w:instrText>
         </w:r>
         <w:r>
           <w:rPr>
+            <w:rFonts w:cs="Times New Roman"/>
             <w:noProof/>
             <w:webHidden/>
+            <w:sz w:val="22"/>
+            <w:szCs w:val="22"/>
           </w:rPr>
         </w:r>
         <w:r>
           <w:rPr>
+            <w:rFonts w:cs="Times New Roman"/>
             <w:noProof/>
             <w:webHidden/>
+            <w:sz w:val="22"/>
+            <w:szCs w:val="22"/>
           </w:rPr>
           <w:fldChar w:fldCharType="separate"/>
         </w:r>
         <w:r>
           <w:rPr>
+            <w:rFonts w:cs="Times New Roman"/>
             <w:noProof/>
             <w:webHidden/>
+            <w:sz w:val="22"/>
+            <w:szCs w:val="22"/>
           </w:rPr>
           <w:t>4</w:t>
         </w:r>
         <w:r>
           <w:rPr>
+            <w:rFonts w:cs="Times New Roman"/>
             <w:noProof/>
             <w:webHidden/>
+            <w:sz w:val="22"/>
+            <w:szCs w:val="22"/>
           </w:rPr>
           <w:fldChar w:fldCharType="end"/>
         </w:r>
@@ -1183,10 +1256,12 @@
         </w:tabs>
         <w:spacing w:line="360" w:lineRule="auto"/>
         <w:rPr>
-          <w:rFonts w:asciiTheme="minorHAnsi" w:eastAsiaTheme="minorEastAsia" w:hAnsiTheme="minorHAnsi"/>
+          <w:rFonts w:eastAsiaTheme="minorEastAsia" w:cs="Times New Roman"/>
           <w:b w:val="0"/>
           <w:noProof/>
           <w:kern w:val="2"/>
+          <w:sz w:val="22"/>
+          <w:szCs w:val="22"/>
           <w:lang w:val="es-CO" w:eastAsia="es-CO"/>
           <w14:ligatures w14:val="standardContextual"/>
         </w:rPr>
@@ -1197,15 +1272,19 @@
             <w:rStyle w:val="Hipervnculo"/>
             <w:rFonts w:eastAsia="Times New Roman" w:cs="Times New Roman"/>
             <w:noProof/>
+            <w:sz w:val="22"/>
+            <w:szCs w:val="22"/>
           </w:rPr>
           <w:t>3.</w:t>
         </w:r>
         <w:r>
           <w:rPr>
-            <w:rFonts w:asciiTheme="minorHAnsi" w:eastAsiaTheme="minorEastAsia" w:hAnsiTheme="minorHAnsi"/>
+            <w:rFonts w:eastAsiaTheme="minorEastAsia" w:cs="Times New Roman"/>
             <w:b w:val="0"/>
             <w:noProof/>
             <w:kern w:val="2"/>
+            <w:sz w:val="22"/>
+            <w:szCs w:val="22"/>
             <w:lang w:val="es-CO" w:eastAsia="es-CO"/>
             <w14:ligatures w14:val="standardContextual"/>
           </w:rPr>
@@ -1216,54 +1295,77 @@
             <w:rStyle w:val="Hipervnculo"/>
             <w:rFonts w:eastAsia="Times New Roman" w:cs="Times New Roman"/>
             <w:noProof/>
+            <w:sz w:val="22"/>
+            <w:szCs w:val="22"/>
           </w:rPr>
           <w:t>Explicación Código Desarrollado</w:t>
         </w:r>
         <w:r>
           <w:rPr>
+            <w:rFonts w:cs="Times New Roman"/>
             <w:noProof/>
             <w:webHidden/>
+            <w:sz w:val="22"/>
+            <w:szCs w:val="22"/>
           </w:rPr>
           <w:tab/>
         </w:r>
         <w:r>
           <w:rPr>
+            <w:rFonts w:cs="Times New Roman"/>
             <w:noProof/>
             <w:webHidden/>
+            <w:sz w:val="22"/>
+            <w:szCs w:val="22"/>
           </w:rPr>
           <w:fldChar w:fldCharType="begin"/>
         </w:r>
         <w:r>
           <w:rPr>
+            <w:rFonts w:cs="Times New Roman"/>
             <w:noProof/>
             <w:webHidden/>
+            <w:sz w:val="22"/>
+            <w:szCs w:val="22"/>
           </w:rPr>
           <w:instrText xml:space="preserve"> PAGEREF _Toc238837455 \h </w:instrText>
         </w:r>
         <w:r>
           <w:rPr>
+            <w:rFonts w:cs="Times New Roman"/>
             <w:noProof/>
             <w:webHidden/>
+            <w:sz w:val="22"/>
+            <w:szCs w:val="22"/>
           </w:rPr>
         </w:r>
         <w:r>
           <w:rPr>
+            <w:rFonts w:cs="Times New Roman"/>
             <w:noProof/>
             <w:webHidden/>
+            <w:sz w:val="22"/>
+            <w:szCs w:val="22"/>
           </w:rPr>
           <w:fldChar w:fldCharType="separate"/>
         </w:r>
         <w:r>
           <w:rPr>
+            <w:rFonts w:cs="Times New Roman"/>
             <w:noProof/>
             <w:webHidden/>
+            <w:sz w:val="22"/>
+            <w:szCs w:val="22"/>
           </w:rPr>
           <w:t>5</w:t>
         </w:r>
         <w:r>
           <w:rPr>
+            <w:rFonts w:cs="Times New Roman"/>
             <w:noProof/>
             <w:webHidden/>
+            <w:sz w:val="22"/>
+            <w:szCs w:val="22"/>
           </w:rPr>
           <w:fldChar w:fldCharType="end"/>
         </w:r>
@@ -1278,10 +1380,12 @@
         </w:tabs>
         <w:spacing w:line="360" w:lineRule="auto"/>
         <w:rPr>
-          <w:rFonts w:asciiTheme="minorHAnsi" w:eastAsiaTheme="minorEastAsia" w:hAnsiTheme="minorHAnsi"/>
+          <w:rFonts w:eastAsiaTheme="minorEastAsia" w:cs="Times New Roman"/>
           <w:b w:val="0"/>
           <w:noProof/>
           <w:kern w:val="2"/>
+          <w:sz w:val="22"/>
+          <w:szCs w:val="22"/>
           <w:lang w:val="es-CO" w:eastAsia="es-CO"/>
           <w14:ligatures w14:val="standardContextual"/>
         </w:rPr>
@@ -1292,15 +1396,19 @@
             <w:rStyle w:val="Hipervnculo"/>
             <w:rFonts w:eastAsia="Arial" w:cs="Times New Roman"/>
             <w:noProof/>
+            <w:sz w:val="22"/>
+            <w:szCs w:val="22"/>
           </w:rPr>
           <w:t>4.</w:t>
         </w:r>
         <w:r>
           <w:rPr>
-            <w:rFonts w:asciiTheme="minorHAnsi" w:eastAsiaTheme="minorEastAsia" w:hAnsiTheme="minorHAnsi"/>
+            <w:rFonts w:eastAsiaTheme="minorEastAsia" w:cs="Times New Roman"/>
             <w:b w:val="0"/>
             <w:noProof/>
             <w:kern w:val="2"/>
+            <w:sz w:val="22"/>
+            <w:szCs w:val="22"/>
             <w:lang w:val="es-CO" w:eastAsia="es-CO"/>
             <w14:ligatures w14:val="standardContextual"/>
           </w:rPr>
@@ -1311,54 +1419,77 @@
             <w:rStyle w:val="Hipervnculo"/>
             <w:rFonts w:eastAsia="Arial" w:cs="Times New Roman"/>
             <w:noProof/>
+            <w:sz w:val="22"/>
+            <w:szCs w:val="22"/>
           </w:rPr>
           <w:t>Pruebas</w:t>
         </w:r>
         <w:r>
           <w:rPr>
+            <w:rFonts w:cs="Times New Roman"/>
             <w:noProof/>
             <w:webHidden/>
+            <w:sz w:val="22"/>
+            <w:szCs w:val="22"/>
           </w:rPr>
           <w:tab/>
         </w:r>
         <w:r>
           <w:rPr>
+            <w:rFonts w:cs="Times New Roman"/>
             <w:noProof/>
             <w:webHidden/>
+            <w:sz w:val="22"/>
+            <w:szCs w:val="22"/>
           </w:rPr>
           <w:fldChar w:fldCharType="begin"/>
         </w:r>
         <w:r>
           <w:rPr>
+            <w:rFonts w:cs="Times New Roman"/>
             <w:noProof/>
             <w:webHidden/>
+            <w:sz w:val="22"/>
+            <w:szCs w:val="22"/>
           </w:rPr>
           <w:instrText xml:space="preserve"> PAGEREF _Toc238837456 \h </w:instrText>
         </w:r>
         <w:r>
           <w:rPr>
+            <w:rFonts w:cs="Times New Roman"/>
             <w:noProof/>
             <w:webHidden/>
+            <w:sz w:val="22"/>
+            <w:szCs w:val="22"/>
           </w:rPr>
         </w:r>
         <w:r>
           <w:rPr>
+            <w:rFonts w:cs="Times New Roman"/>
             <w:noProof/>
             <w:webHidden/>
+            <w:sz w:val="22"/>
+            <w:szCs w:val="22"/>
           </w:rPr>
           <w:fldChar w:fldCharType="separate"/>
         </w:r>
         <w:r>
           <w:rPr>
+            <w:rFonts w:cs="Times New Roman"/>
             <w:noProof/>
             <w:webHidden/>
+            <w:sz w:val="22"/>
+            <w:szCs w:val="22"/>
           </w:rPr>
           <w:t>6</w:t>
         </w:r>
         <w:r>
           <w:rPr>
+            <w:rFonts w:cs="Times New Roman"/>
             <w:noProof/>
             <w:webHidden/>
+            <w:sz w:val="22"/>
+            <w:szCs w:val="22"/>
           </w:rPr>
           <w:fldChar w:fldCharType="end"/>
         </w:r>
@@ -1447,6 +1578,7 @@
       <w:pPr>
         <w:spacing w:line="360" w:lineRule="auto"/>
         <w:rPr>
+          <w:rFonts w:ascii="Times New Roman" w:hAnsi="Times New Roman" w:cs="Times New Roman"/>
           <w:lang w:val="es-ES"/>
         </w:rPr>
       </w:pPr>
@@ -1454,9 +1586,13 @@
     <w:p>
       <w:pPr>
         <w:spacing w:line="360" w:lineRule="auto"/>
-      </w:pPr>
-      <w:r>
-        <w:rPr>
+        <w:rPr>
+          <w:rFonts w:ascii="Times New Roman" w:hAnsi="Times New Roman" w:cs="Times New Roman"/>
+        </w:rPr>
+      </w:pPr>
+      <w:r>
+        <w:rPr>
+          <w:rFonts w:ascii="Times New Roman" w:hAnsi="Times New Roman" w:cs="Times New Roman"/>
           <w:lang w:val="es-ES"/>
         </w:rPr>
         <w:t xml:space="preserve">LINK DEL REPOSITORIO: </w:t>
@@ -1465,188 +1601,360 @@
         <w:r>
           <w:rPr>
             <w:rStyle w:val="Hipervnculo"/>
+            <w:rFonts w:ascii="Times New Roman" w:hAnsi="Times New Roman" w:cs="Times New Roman"/>
             <w:lang w:val="es-ES"/>
           </w:rPr>
           <w:t>https://github.com/Jimmy86gb/CC2_GR5_020_84.git</w:t>
         </w:r>
       </w:hyperlink>
       <w:r>
+        <w:rPr>
+          <w:rFonts w:ascii="Times New Roman" w:hAnsi="Times New Roman" w:cs="Times New Roman"/>
+        </w:rPr>
         <w:t xml:space="preserve"> </w:t>
       </w:r>
     </w:p>
     <w:p>
       <w:pPr>
         <w:spacing w:line="360" w:lineRule="auto"/>
-      </w:pPr>
-      <w:r>
+        <w:rPr>
+          <w:rFonts w:ascii="Times New Roman" w:hAnsi="Times New Roman" w:cs="Times New Roman"/>
+        </w:rPr>
+      </w:pPr>
+      <w:r>
+        <w:rPr>
+          <w:rFonts w:ascii="Times New Roman" w:hAnsi="Times New Roman" w:cs="Times New Roman"/>
+        </w:rPr>
         <w:t xml:space="preserve">Ruta de Entrega: </w:t>
       </w:r>
+      <w:r>
+        <w:rPr>
+          <w:rFonts w:ascii="Times New Roman" w:hAnsi="Times New Roman" w:cs="Times New Roman"/>
+        </w:rPr>
+        <w:t>1</w:t>
+      </w:r>
+      <w:r>
+        <w:rPr>
+          <w:rFonts w:ascii="Times New Roman" w:hAnsi="Times New Roman" w:cs="Times New Roman"/>
+        </w:rPr>
+        <w:t>ER_CORTE/3_Algoritmo_De_Generación_De_Numeros_Pseudoaleatorios/Entrega</w:t>
+      </w:r>
     </w:p>
     <w:p>
       <w:pPr>
         <w:spacing w:line="360" w:lineRule="auto"/>
-      </w:pPr>
-      <w:r>
+        <w:rPr>
+          <w:rFonts w:ascii="Times New Roman" w:hAnsi="Times New Roman" w:cs="Times New Roman"/>
+        </w:rPr>
+      </w:pPr>
+      <w:r>
+        <w:rPr>
+          <w:rFonts w:ascii="Times New Roman" w:hAnsi="Times New Roman" w:cs="Times New Roman"/>
+        </w:rPr>
         <w:t>La generación de números pseudoaleatorios es un componente fundamental en el desarrollo de software, con aplicaciones</w:t>
       </w:r>
       <w:r>
+        <w:rPr>
+          <w:rFonts w:ascii="Times New Roman" w:hAnsi="Times New Roman" w:cs="Times New Roman"/>
+        </w:rPr>
         <w:t xml:space="preserve"> que van desde la simulación de escenarios y pruebas de estrés en estructuras de datos, hasta la criptografía y el model</w:t>
       </w:r>
       <w:r>
+        <w:rPr>
+          <w:rFonts w:ascii="Times New Roman" w:hAnsi="Times New Roman" w:cs="Times New Roman"/>
+        </w:rPr>
         <w:t>o estadístico. A diferencia de los números verdaderamente aleatorios, los números pseudoaleatorios se</w:t>
       </w:r>
       <w:r>
+        <w:rPr>
+          <w:rFonts w:ascii="Times New Roman" w:hAnsi="Times New Roman" w:cs="Times New Roman"/>
+        </w:rPr>
         <w:t xml:space="preserve"> </w:t>
       </w:r>
       <w:r>
+        <w:rPr>
+          <w:rFonts w:ascii="Times New Roman" w:hAnsi="Times New Roman" w:cs="Times New Roman"/>
+        </w:rPr>
         <w:t>generan</w:t>
       </w:r>
       <w:r>
+        <w:rPr>
+          <w:rFonts w:ascii="Times New Roman" w:hAnsi="Times New Roman" w:cs="Times New Roman"/>
+        </w:rPr>
         <w:t xml:space="preserve"> </w:t>
       </w:r>
       <w:r>
+        <w:rPr>
+          <w:rFonts w:ascii="Times New Roman" w:hAnsi="Times New Roman" w:cs="Times New Roman"/>
+        </w:rPr>
         <w:t>mediante</w:t>
       </w:r>
       <w:r>
+        <w:rPr>
+          <w:rFonts w:ascii="Times New Roman" w:hAnsi="Times New Roman" w:cs="Times New Roman"/>
+        </w:rPr>
         <w:t xml:space="preserve"> algoritmos</w:t>
       </w:r>
       <w:r>
+        <w:rPr>
+          <w:rFonts w:ascii="Times New Roman" w:hAnsi="Times New Roman" w:cs="Times New Roman"/>
+        </w:rPr>
         <w:t xml:space="preserve"> </w:t>
       </w:r>
       <w:r>
+        <w:rPr>
+          <w:rFonts w:ascii="Times New Roman" w:hAnsi="Times New Roman" w:cs="Times New Roman"/>
+        </w:rPr>
         <w:t>determinísticos</w:t>
       </w:r>
       <w:r>
+        <w:rPr>
+          <w:rFonts w:ascii="Times New Roman" w:hAnsi="Times New Roman" w:cs="Times New Roman"/>
+        </w:rPr>
         <w:t xml:space="preserve"> </w:t>
       </w:r>
       <w:r>
+        <w:rPr>
+          <w:rFonts w:ascii="Times New Roman" w:hAnsi="Times New Roman" w:cs="Times New Roman"/>
+        </w:rPr>
         <w:t>que, partiendo de una semilla inicial, producen secuencias de valores cuyo comportamiento estadístico simula el de una distribución uniforme</w:t>
       </w:r>
       <w:r>
+        <w:rPr>
+          <w:rFonts w:ascii="Times New Roman" w:hAnsi="Times New Roman" w:cs="Times New Roman"/>
+        </w:rPr>
         <w:t>.</w:t>
       </w:r>
     </w:p>
     <w:p>
       <w:pPr>
         <w:spacing w:line="360" w:lineRule="auto"/>
+        <w:rPr>
+          <w:rFonts w:ascii="Times New Roman" w:hAnsi="Times New Roman" w:cs="Times New Roman"/>
+        </w:rPr>
       </w:pPr>
     </w:p>
     <w:p>
       <w:pPr>
         <w:spacing w:line="360" w:lineRule="auto"/>
-      </w:pPr>
-      <w:r>
+        <w:rPr>
+          <w:rFonts w:ascii="Times New Roman" w:hAnsi="Times New Roman" w:cs="Times New Roman"/>
+        </w:rPr>
+      </w:pPr>
+      <w:r>
+        <w:rPr>
+          <w:rFonts w:ascii="Times New Roman" w:hAnsi="Times New Roman" w:cs="Times New Roman"/>
+        </w:rPr>
         <w:t xml:space="preserve">En el presente informe se documenta el diseño e </w:t>
       </w:r>
       <w:r>
+        <w:rPr>
+          <w:rFonts w:ascii="Times New Roman" w:hAnsi="Times New Roman" w:cs="Times New Roman"/>
+        </w:rPr>
         <w:t>implementación de</w:t>
       </w:r>
       <w:r>
+        <w:rPr>
+          <w:rFonts w:ascii="Times New Roman" w:hAnsi="Times New Roman" w:cs="Times New Roman"/>
+        </w:rPr>
         <w:t xml:space="preserve"> un algoritmo generador de números pseudoaleatorios desarrollado en C++, cuya </w:t>
       </w:r>
       <w:r>
+        <w:rPr>
+          <w:rFonts w:ascii="Times New Roman" w:hAnsi="Times New Roman" w:cs="Times New Roman"/>
+        </w:rPr>
         <w:t xml:space="preserve">particularidad </w:t>
       </w:r>
       <w:r>
+        <w:rPr>
+          <w:rFonts w:ascii="Times New Roman" w:hAnsi="Times New Roman" w:cs="Times New Roman"/>
+        </w:rPr>
         <w:t>radica</w:t>
       </w:r>
       <w:r>
+        <w:rPr>
+          <w:rFonts w:ascii="Times New Roman" w:hAnsi="Times New Roman" w:cs="Times New Roman"/>
+        </w:rPr>
         <w:t xml:space="preserve"> en el uso del algoritmo BBP (Bailey-</w:t>
       </w:r>
       <w:proofErr w:type="spellStart"/>
       <w:r>
+        <w:rPr>
+          <w:rFonts w:ascii="Times New Roman" w:hAnsi="Times New Roman" w:cs="Times New Roman"/>
+        </w:rPr>
         <w:t>Borwein</w:t>
       </w:r>
       <w:proofErr w:type="spellEnd"/>
       <w:r>
+        <w:rPr>
+          <w:rFonts w:ascii="Times New Roman" w:hAnsi="Times New Roman" w:cs="Times New Roman"/>
+        </w:rPr>
         <w:t>-Plouffe) como fuente de entropía</w:t>
       </w:r>
       <w:r>
+        <w:rPr>
+          <w:rFonts w:ascii="Times New Roman" w:hAnsi="Times New Roman" w:cs="Times New Roman"/>
+        </w:rPr>
         <w:t>. Este algoritmo permite calcular dígitos hexadecimales de pi en posiciones arbitrarias</w:t>
       </w:r>
       <w:r>
+        <w:rPr>
+          <w:rFonts w:ascii="Times New Roman" w:hAnsi="Times New Roman" w:cs="Times New Roman"/>
+        </w:rPr>
         <w:t xml:space="preserve"> sin necesidad de conocer ni calcular los dígitos que le preceden, </w:t>
       </w:r>
       <w:r>
+        <w:rPr>
+          <w:rFonts w:ascii="Times New Roman" w:hAnsi="Times New Roman" w:cs="Times New Roman"/>
+        </w:rPr>
         <w:t>lo cual resulta idóneo</w:t>
       </w:r>
       <w:r>
+        <w:rPr>
+          <w:rFonts w:ascii="Times New Roman" w:hAnsi="Times New Roman" w:cs="Times New Roman"/>
+        </w:rPr>
         <w:t xml:space="preserve"> </w:t>
       </w:r>
       <w:r>
+        <w:rPr>
+          <w:rFonts w:ascii="Times New Roman" w:hAnsi="Times New Roman" w:cs="Times New Roman"/>
+        </w:rPr>
         <w:t>para introducir variabilidad en el estado interno del generador sin depender de fuentes externas de aleatoriedad</w:t>
       </w:r>
       <w:r>
+        <w:rPr>
+          <w:rFonts w:ascii="Times New Roman" w:hAnsi="Times New Roman" w:cs="Times New Roman"/>
+        </w:rPr>
         <w:t>.</w:t>
       </w:r>
     </w:p>
     <w:p>
       <w:pPr>
         <w:spacing w:line="360" w:lineRule="auto"/>
+        <w:rPr>
+          <w:rFonts w:ascii="Times New Roman" w:hAnsi="Times New Roman" w:cs="Times New Roman"/>
+        </w:rPr>
       </w:pPr>
     </w:p>
     <w:p>
       <w:pPr>
         <w:spacing w:line="360" w:lineRule="auto"/>
-      </w:pPr>
-      <w:r>
+        <w:rPr>
+          <w:rFonts w:ascii="Times New Roman" w:hAnsi="Times New Roman" w:cs="Times New Roman"/>
+        </w:rPr>
+      </w:pPr>
+      <w:r>
+        <w:rPr>
+          <w:rFonts w:ascii="Times New Roman" w:hAnsi="Times New Roman" w:cs="Times New Roman"/>
+        </w:rPr>
         <w:t>El proceso combina los dígitos extraídos de pi con un estado interno de 32 bits mediante o</w:t>
       </w:r>
       <w:r>
+        <w:rPr>
+          <w:rFonts w:ascii="Times New Roman" w:hAnsi="Times New Roman" w:cs="Times New Roman"/>
+        </w:rPr>
         <w:t xml:space="preserve">peraciones a nivel de bits –desplazamiento a la derecha, XOR y negación-, buscando maximizar </w:t>
       </w:r>
       <w:r>
+        <w:rPr>
+          <w:rFonts w:ascii="Times New Roman" w:hAnsi="Times New Roman" w:cs="Times New Roman"/>
+        </w:rPr>
         <w:t xml:space="preserve">el efecto avalancha y evitar la </w:t>
       </w:r>
       <w:r>
+        <w:rPr>
+          <w:rFonts w:ascii="Times New Roman" w:hAnsi="Times New Roman" w:cs="Times New Roman"/>
+        </w:rPr>
         <w:t>aparición de</w:t>
       </w:r>
       <w:r>
+        <w:rPr>
+          <w:rFonts w:ascii="Times New Roman" w:hAnsi="Times New Roman" w:cs="Times New Roman"/>
+        </w:rPr>
         <w:t xml:space="preserve"> patrones lineales predecibles en </w:t>
       </w:r>
       <w:r>
+        <w:rPr>
+          <w:rFonts w:ascii="Times New Roman" w:hAnsi="Times New Roman" w:cs="Times New Roman"/>
+        </w:rPr>
         <w:t xml:space="preserve">la salida. </w:t>
       </w:r>
       <w:r>
+        <w:rPr>
+          <w:rFonts w:ascii="Times New Roman" w:hAnsi="Times New Roman" w:cs="Times New Roman"/>
+        </w:rPr>
         <w:t>Adicionalmente</w:t>
       </w:r>
       <w:r>
+        <w:rPr>
+          <w:rFonts w:ascii="Times New Roman" w:hAnsi="Times New Roman" w:cs="Times New Roman"/>
+        </w:rPr>
         <w:t>,</w:t>
       </w:r>
       <w:r>
+        <w:rPr>
+          <w:rFonts w:ascii="Times New Roman" w:hAnsi="Times New Roman" w:cs="Times New Roman"/>
+        </w:rPr>
         <w:t xml:space="preserve"> el generador incorpora una fase de calentamiento (</w:t>
       </w:r>
       <w:proofErr w:type="spellStart"/>
       <w:r>
+        <w:rPr>
+          <w:rFonts w:ascii="Times New Roman" w:hAnsi="Times New Roman" w:cs="Times New Roman"/>
+        </w:rPr>
         <w:t>warm</w:t>
       </w:r>
       <w:proofErr w:type="spellEnd"/>
       <w:r>
+        <w:rPr>
+          <w:rFonts w:ascii="Times New Roman" w:hAnsi="Times New Roman" w:cs="Times New Roman"/>
+        </w:rPr>
         <w:t>-up) previa a la generación de resultados, con el fin de que la influencia</w:t>
       </w:r>
       <w:r>
+        <w:rPr>
+          <w:rFonts w:ascii="Times New Roman" w:hAnsi="Times New Roman" w:cs="Times New Roman"/>
+        </w:rPr>
         <w:t xml:space="preserve"> de los dígitos de pi sobre el estado tenga tiempo de propagarse adecuadamente antes producir valores útiles.</w:t>
       </w:r>
     </w:p>
     <w:p>
       <w:pPr>
         <w:spacing w:line="360" w:lineRule="auto"/>
+        <w:rPr>
+          <w:rFonts w:ascii="Times New Roman" w:hAnsi="Times New Roman" w:cs="Times New Roman"/>
+        </w:rPr>
       </w:pPr>
     </w:p>
     <w:p>
       <w:pPr>
         <w:spacing w:line="360" w:lineRule="auto"/>
-      </w:pPr>
-      <w:r>
+        <w:rPr>
+          <w:rFonts w:ascii="Times New Roman" w:hAnsi="Times New Roman" w:cs="Times New Roman"/>
+        </w:rPr>
+      </w:pPr>
+      <w:r>
+        <w:rPr>
+          <w:rFonts w:ascii="Times New Roman" w:hAnsi="Times New Roman" w:cs="Times New Roman"/>
+        </w:rPr>
         <w:t>A lo la</w:t>
       </w:r>
       <w:r>
+        <w:rPr>
+          <w:rFonts w:ascii="Times New Roman" w:hAnsi="Times New Roman" w:cs="Times New Roman"/>
+        </w:rPr>
         <w:t>rgo del documento se explica en detalle la lógica de cada función implementada y se presentan los resultados</w:t>
       </w:r>
       <w:r>
+        <w:rPr>
+          <w:rFonts w:ascii="Times New Roman" w:hAnsi="Times New Roman" w:cs="Times New Roman"/>
+        </w:rPr>
         <w:t xml:space="preserve"> obtenidos al generar una muestra de 10.000 números dentro de un rango acotado, evaluando su distribución de frecuencias como criterio para determinar la cali</w:t>
       </w:r>
       <w:r>
+        <w:rPr>
+          <w:rFonts w:ascii="Times New Roman" w:hAnsi="Times New Roman" w:cs="Times New Roman"/>
+        </w:rPr>
         <w:t>dad y uniformidad del generador propuesto.</w:t>
       </w:r>
     </w:p>
@@ -1767,6 +2075,15 @@
     </w:p>
     <w:p>
       <w:pPr>
+        <w:spacing w:line="360" w:lineRule="auto"/>
+        <w:rPr>
+          <w:rFonts w:ascii="Times New Roman" w:eastAsia="Times New Roman" w:hAnsi="Times New Roman" w:cs="Times New Roman"/>
+          <w:lang w:val="es-ES"/>
+        </w:rPr>
+      </w:pPr>
+    </w:p>
+    <w:p>
+      <w:pPr>
         <w:pStyle w:val="Ttulo2"/>
         <w:numPr>
           <w:ilvl w:val="1"/>
@@ -1805,14 +2122,15 @@
           <w:ilvl w:val="0"/>
           <w:numId w:val="30"/>
         </w:numPr>
-        <w:rPr>
-          <w:rFonts w:ascii="Calibri" w:eastAsia="Calibri" w:hAnsi="Calibri" w:cs="Calibri"/>
+        <w:spacing w:line="360" w:lineRule="auto"/>
+        <w:rPr>
+          <w:rFonts w:ascii="Times New Roman" w:eastAsia="Calibri" w:hAnsi="Times New Roman" w:cs="Times New Roman"/>
           <w:lang w:val="es-ES"/>
         </w:rPr>
       </w:pPr>
       <w:r>
         <w:rPr>
-          <w:rFonts w:ascii="Calibri" w:eastAsia="Calibri" w:hAnsi="Calibri" w:cs="Calibri"/>
+          <w:rFonts w:ascii="Times New Roman" w:eastAsia="Calibri" w:hAnsi="Times New Roman" w:cs="Times New Roman"/>
           <w:b/>
           <w:bCs/>
           <w:lang w:val="es-ES"/>
@@ -1822,7 +2140,7 @@
       <w:proofErr w:type="spellStart"/>
       <w:r>
         <w:rPr>
-          <w:rFonts w:ascii="Calibri" w:eastAsia="Calibri" w:hAnsi="Calibri" w:cs="Calibri"/>
+          <w:rFonts w:ascii="Times New Roman" w:eastAsia="Calibri" w:hAnsi="Times New Roman" w:cs="Times New Roman"/>
           <w:b/>
           <w:bCs/>
           <w:lang w:val="es-ES"/>
@@ -1832,7 +2150,7 @@
       <w:proofErr w:type="spellEnd"/>
       <w:r>
         <w:rPr>
-          <w:rFonts w:ascii="Calibri" w:eastAsia="Calibri" w:hAnsi="Calibri" w:cs="Calibri"/>
+          <w:rFonts w:ascii="Times New Roman" w:eastAsia="Calibri" w:hAnsi="Times New Roman" w:cs="Times New Roman"/>
           <w:b/>
           <w:bCs/>
           <w:lang w:val="es-ES"/>
@@ -1841,7 +2159,7 @@
       </w:r>
       <w:r>
         <w:rPr>
-          <w:rFonts w:ascii="Calibri" w:eastAsia="Calibri" w:hAnsi="Calibri" w:cs="Calibri"/>
+          <w:rFonts w:ascii="Times New Roman" w:eastAsia="Calibri" w:hAnsi="Times New Roman" w:cs="Times New Roman"/>
           <w:lang w:val="es-ES"/>
         </w:rPr>
         <w:t xml:space="preserve"> para obtener dígitos hexadecimales de π desde diferentes posiciones sin necesidad de calcular todos los dígitos anteriores. </w:t>
@@ -1854,14 +2172,15 @@
           <w:ilvl w:val="0"/>
           <w:numId w:val="30"/>
         </w:numPr>
-        <w:rPr>
-          <w:rFonts w:ascii="Calibri" w:eastAsia="Calibri" w:hAnsi="Calibri" w:cs="Calibri"/>
+        <w:spacing w:line="360" w:lineRule="auto"/>
+        <w:rPr>
+          <w:rFonts w:ascii="Times New Roman" w:eastAsia="Calibri" w:hAnsi="Times New Roman" w:cs="Times New Roman"/>
           <w:lang w:val="es-ES"/>
         </w:rPr>
       </w:pPr>
       <w:r>
         <w:rPr>
-          <w:rFonts w:ascii="Calibri" w:eastAsia="Calibri" w:hAnsi="Calibri" w:cs="Calibri"/>
+          <w:rFonts w:ascii="Times New Roman" w:eastAsia="Calibri" w:hAnsi="Times New Roman" w:cs="Times New Roman"/>
           <w:b/>
           <w:bCs/>
           <w:lang w:val="es-ES"/>
@@ -1870,7 +2189,7 @@
       </w:r>
       <w:r>
         <w:rPr>
-          <w:rFonts w:ascii="Calibri" w:eastAsia="Calibri" w:hAnsi="Calibri" w:cs="Calibri"/>
+          <w:rFonts w:ascii="Times New Roman" w:eastAsia="Calibri" w:hAnsi="Times New Roman" w:cs="Times New Roman"/>
           <w:lang w:val="es-ES"/>
         </w:rPr>
         <w:t xml:space="preserve"> que combine los dígitos obtenidos de π con un estado interno mediante operaciones a nivel de bits, como desplazamiento, XOR y negación. </w:t>
@@ -1883,14 +2202,15 @@
           <w:ilvl w:val="0"/>
           <w:numId w:val="30"/>
         </w:numPr>
-        <w:rPr>
-          <w:rFonts w:ascii="Calibri" w:eastAsia="Calibri" w:hAnsi="Calibri" w:cs="Calibri"/>
+        <w:spacing w:line="360" w:lineRule="auto"/>
+        <w:rPr>
+          <w:rFonts w:ascii="Times New Roman" w:eastAsia="Calibri" w:hAnsi="Times New Roman" w:cs="Times New Roman"/>
           <w:lang w:val="es-ES"/>
         </w:rPr>
       </w:pPr>
       <w:r>
         <w:rPr>
-          <w:rFonts w:ascii="Calibri" w:eastAsia="Calibri" w:hAnsi="Calibri" w:cs="Calibri"/>
+          <w:rFonts w:ascii="Times New Roman" w:eastAsia="Calibri" w:hAnsi="Times New Roman" w:cs="Times New Roman"/>
           <w:b/>
           <w:bCs/>
           <w:lang w:val="es-ES"/>
@@ -1899,7 +2219,7 @@
       </w:r>
       <w:r>
         <w:rPr>
-          <w:rFonts w:ascii="Calibri" w:eastAsia="Calibri" w:hAnsi="Calibri" w:cs="Calibri"/>
+          <w:rFonts w:ascii="Times New Roman" w:eastAsia="Calibri" w:hAnsi="Times New Roman" w:cs="Times New Roman"/>
           <w:lang w:val="es-ES"/>
         </w:rPr>
         <w:t xml:space="preserve"> mediante parámetros como la posición inicial en π, el salto entre posiciones, el desplazamiento de bits, el límite de los valores generados y la cantidad de números requeridos. </w:t>
@@ -1912,14 +2232,15 @@
           <w:ilvl w:val="0"/>
           <w:numId w:val="30"/>
         </w:numPr>
-        <w:rPr>
-          <w:rFonts w:ascii="Calibri" w:eastAsia="Calibri" w:hAnsi="Calibri" w:cs="Calibri"/>
+        <w:spacing w:line="360" w:lineRule="auto"/>
+        <w:rPr>
+          <w:rFonts w:ascii="Times New Roman" w:eastAsia="Calibri" w:hAnsi="Times New Roman" w:cs="Times New Roman"/>
           <w:lang w:val="es-ES"/>
         </w:rPr>
       </w:pPr>
       <w:r>
         <w:rPr>
-          <w:rFonts w:ascii="Calibri" w:eastAsia="Calibri" w:hAnsi="Calibri" w:cs="Calibri"/>
+          <w:rFonts w:ascii="Times New Roman" w:eastAsia="Calibri" w:hAnsi="Times New Roman" w:cs="Times New Roman"/>
           <w:b/>
           <w:bCs/>
           <w:lang w:val="es-ES"/>
@@ -1928,7 +2249,7 @@
       </w:r>
       <w:r>
         <w:rPr>
-          <w:rFonts w:ascii="Calibri" w:eastAsia="Calibri" w:hAnsi="Calibri" w:cs="Calibri"/>
+          <w:rFonts w:ascii="Times New Roman" w:eastAsia="Calibri" w:hAnsi="Times New Roman" w:cs="Times New Roman"/>
           <w:lang w:val="es-ES"/>
         </w:rPr>
         <w:t xml:space="preserve">, aplicando una operación de módulo al estado resultante para adaptar los valores al límite indicado por el usuario. </w:t>
@@ -1941,14 +2262,15 @@
           <w:ilvl w:val="0"/>
           <w:numId w:val="30"/>
         </w:numPr>
-        <w:rPr>
-          <w:rFonts w:ascii="Calibri" w:eastAsia="Calibri" w:hAnsi="Calibri" w:cs="Calibri"/>
+        <w:spacing w:line="360" w:lineRule="auto"/>
+        <w:rPr>
+          <w:rFonts w:ascii="Times New Roman" w:eastAsia="Calibri" w:hAnsi="Times New Roman" w:cs="Times New Roman"/>
           <w:lang w:val="es-ES"/>
         </w:rPr>
       </w:pPr>
       <w:r>
         <w:rPr>
-          <w:rFonts w:ascii="Calibri" w:eastAsia="Calibri" w:hAnsi="Calibri" w:cs="Calibri"/>
+          <w:rFonts w:ascii="Times New Roman" w:eastAsia="Calibri" w:hAnsi="Times New Roman" w:cs="Times New Roman"/>
           <w:b/>
           <w:bCs/>
           <w:lang w:val="es-ES"/>
@@ -1957,7 +2279,7 @@
       </w:r>
       <w:r>
         <w:rPr>
-          <w:rFonts w:ascii="Calibri" w:eastAsia="Calibri" w:hAnsi="Calibri" w:cs="Calibri"/>
+          <w:rFonts w:ascii="Times New Roman" w:eastAsia="Calibri" w:hAnsi="Times New Roman" w:cs="Times New Roman"/>
           <w:lang w:val="es-ES"/>
         </w:rPr>
         <w:t xml:space="preserve"> mediante diferentes tamaños de muestra, observando la frecuencia de aparición de cada valor para determinar qué tan uniforme es el comportamiento del generador. </w:t>
@@ -1970,14 +2292,15 @@
           <w:ilvl w:val="0"/>
           <w:numId w:val="30"/>
         </w:numPr>
-        <w:rPr>
-          <w:rFonts w:ascii="Calibri" w:eastAsia="Calibri" w:hAnsi="Calibri" w:cs="Calibri"/>
+        <w:spacing w:line="360" w:lineRule="auto"/>
+        <w:rPr>
+          <w:rFonts w:ascii="Times New Roman" w:eastAsia="Calibri" w:hAnsi="Times New Roman" w:cs="Times New Roman"/>
           <w:lang w:val="es-ES"/>
         </w:rPr>
       </w:pPr>
       <w:r>
         <w:rPr>
-          <w:rFonts w:ascii="Calibri" w:eastAsia="Calibri" w:hAnsi="Calibri" w:cs="Calibri"/>
+          <w:rFonts w:ascii="Times New Roman" w:eastAsia="Calibri" w:hAnsi="Times New Roman" w:cs="Times New Roman"/>
           <w:b/>
           <w:bCs/>
           <w:lang w:val="es-ES"/>
@@ -1986,7 +2309,7 @@
       </w:r>
       <w:r>
         <w:rPr>
-          <w:rFonts w:ascii="Calibri" w:eastAsia="Calibri" w:hAnsi="Calibri" w:cs="Calibri"/>
+          <w:rFonts w:ascii="Times New Roman" w:eastAsia="Calibri" w:hAnsi="Times New Roman" w:cs="Times New Roman"/>
           <w:lang w:val="es-ES"/>
         </w:rPr>
         <w:t xml:space="preserve"> sobre los resultados obtenidos, identificando configuraciones que permitan mantener un comportamiento pseudoaleatorio y una distribución adecuada.</w:t>
@@ -1995,6 +2318,9 @@
     <w:p>
       <w:pPr>
         <w:spacing w:line="360" w:lineRule="auto"/>
+        <w:rPr>
+          <w:rFonts w:ascii="Times New Roman" w:hAnsi="Times New Roman" w:cs="Times New Roman"/>
+        </w:rPr>
       </w:pPr>
       <w:r>
         <w:rPr>
@@ -2073,33 +2399,50 @@
     </w:p>
     <w:p>
       <w:pPr>
+        <w:spacing w:line="360" w:lineRule="auto"/>
+        <w:rPr>
+          <w:rFonts w:ascii="Times New Roman" w:hAnsi="Times New Roman" w:cs="Times New Roman"/>
+          <w:lang w:val="es-ES"/>
+        </w:rPr>
+      </w:pPr>
+    </w:p>
+    <w:p>
+      <w:pPr>
         <w:pStyle w:val="Ttulo2"/>
-        <w:spacing w:before="0" w:after="299" w:line="360" w:lineRule="auto"/>
-        <w:rPr>
+        <w:numPr>
+          <w:ilvl w:val="1"/>
+          <w:numId w:val="9"/>
+        </w:numPr>
+        <w:spacing w:before="0" w:after="0" w:line="360" w:lineRule="auto"/>
+        <w:ind w:left="357" w:hanging="357"/>
+        <w:rPr>
+          <w:rFonts w:ascii="Times New Roman" w:eastAsia="Arial" w:hAnsi="Times New Roman" w:cs="Times New Roman"/>
+          <w:b/>
+          <w:color w:val="auto"/>
+          <w:sz w:val="22"/>
+          <w:szCs w:val="22"/>
           <w:lang w:val="en-US"/>
         </w:rPr>
       </w:pPr>
       <w:r>
         <w:rPr>
-          <w:rFonts w:ascii="Times New Roman" w:eastAsia="Times New Roman" w:hAnsi="Times New Roman" w:cs="Times New Roman"/>
-          <w:b/>
-          <w:bCs/>
+          <w:rFonts w:ascii="Times New Roman" w:eastAsia="Arial" w:hAnsi="Times New Roman" w:cs="Times New Roman"/>
+          <w:b/>
           <w:color w:val="auto"/>
-          <w:sz w:val="36"/>
-          <w:szCs w:val="36"/>
+          <w:sz w:val="22"/>
+          <w:szCs w:val="22"/>
           <w:lang w:val="en-US"/>
         </w:rPr>
-        <w:t xml:space="preserve">1. </w:t>
+        <w:t xml:space="preserve"> </w:t>
       </w:r>
       <w:proofErr w:type="spellStart"/>
       <w:r>
         <w:rPr>
-          <w:rFonts w:ascii="Times New Roman" w:eastAsia="Times New Roman" w:hAnsi="Times New Roman" w:cs="Times New Roman"/>
-          <w:b/>
-          <w:bCs/>
+          <w:rFonts w:ascii="Times New Roman" w:eastAsia="Arial" w:hAnsi="Times New Roman" w:cs="Times New Roman"/>
+          <w:b/>
           <w:color w:val="auto"/>
-          <w:sz w:val="36"/>
-          <w:szCs w:val="36"/>
+          <w:sz w:val="22"/>
+          <w:szCs w:val="22"/>
           <w:lang w:val="en-US"/>
         </w:rPr>
         <w:t>Algoritmo</w:t>
@@ -2107,12 +2450,11 @@
       <w:proofErr w:type="spellEnd"/>
       <w:r>
         <w:rPr>
-          <w:rFonts w:ascii="Times New Roman" w:eastAsia="Times New Roman" w:hAnsi="Times New Roman" w:cs="Times New Roman"/>
-          <w:b/>
-          <w:bCs/>
+          <w:rFonts w:ascii="Times New Roman" w:eastAsia="Arial" w:hAnsi="Times New Roman" w:cs="Times New Roman"/>
+          <w:b/>
           <w:color w:val="auto"/>
-          <w:sz w:val="36"/>
-          <w:szCs w:val="36"/>
+          <w:sz w:val="22"/>
+          <w:szCs w:val="22"/>
           <w:lang w:val="en-US"/>
         </w:rPr>
         <w:t xml:space="preserve"> BBP (Bailey–</w:t>
@@ -2120,12 +2462,11 @@
       <w:proofErr w:type="spellStart"/>
       <w:r>
         <w:rPr>
-          <w:rFonts w:ascii="Times New Roman" w:eastAsia="Times New Roman" w:hAnsi="Times New Roman" w:cs="Times New Roman"/>
-          <w:b/>
-          <w:bCs/>
+          <w:rFonts w:ascii="Times New Roman" w:eastAsia="Arial" w:hAnsi="Times New Roman" w:cs="Times New Roman"/>
+          <w:b/>
           <w:color w:val="auto"/>
-          <w:sz w:val="36"/>
-          <w:szCs w:val="36"/>
+          <w:sz w:val="22"/>
+          <w:szCs w:val="22"/>
           <w:lang w:val="en-US"/>
         </w:rPr>
         <w:t>Borwein</w:t>
@@ -2133,12 +2474,11 @@
       <w:proofErr w:type="spellEnd"/>
       <w:r>
         <w:rPr>
-          <w:rFonts w:ascii="Times New Roman" w:eastAsia="Times New Roman" w:hAnsi="Times New Roman" w:cs="Times New Roman"/>
-          <w:b/>
-          <w:bCs/>
+          <w:rFonts w:ascii="Times New Roman" w:eastAsia="Arial" w:hAnsi="Times New Roman" w:cs="Times New Roman"/>
+          <w:b/>
           <w:color w:val="auto"/>
-          <w:sz w:val="36"/>
-          <w:szCs w:val="36"/>
+          <w:sz w:val="22"/>
+          <w:szCs w:val="22"/>
           <w:lang w:val="en-US"/>
         </w:rPr>
         <w:t>–Plouffe)</w:t>
@@ -2147,7 +2487,7 @@
     <w:p>
       <w:pPr>
         <w:pStyle w:val="Ttulo2"/>
-        <w:spacing w:before="0" w:after="299" w:line="360" w:lineRule="auto"/>
+        <w:spacing w:before="0" w:after="0" w:line="360" w:lineRule="auto"/>
         <w:rPr>
           <w:rFonts w:ascii="Times New Roman" w:eastAsia="Times New Roman" w:hAnsi="Times New Roman" w:cs="Times New Roman"/>
           <w:color w:val="auto"/>
@@ -2179,7 +2519,9 @@
       <m:oMath>
         <m:r>
           <w:rPr>
-            <w:rFonts w:ascii="Cambria Math" w:hAnsi="Cambria Math"/>
+            <w:rFonts w:ascii="Cambria Math" w:hAnsi="Cambria Math" w:cs="Times New Roman"/>
+            <w:sz w:val="22"/>
+            <w:szCs w:val="22"/>
           </w:rPr>
           <m:t>π</m:t>
         </m:r>
@@ -2207,7 +2549,9 @@
       <m:oMath>
         <m:r>
           <w:rPr>
-            <w:rFonts w:ascii="Cambria Math" w:hAnsi="Cambria Math"/>
+            <w:rFonts w:ascii="Cambria Math" w:hAnsi="Cambria Math" w:cs="Times New Roman"/>
+            <w:sz w:val="22"/>
+            <w:szCs w:val="22"/>
           </w:rPr>
           <m:t>π</m:t>
         </m:r>
@@ -2225,13 +2569,16 @@
     </w:p>
     <w:p>
       <w:pPr>
-        <w:spacing w:after="240" w:line="360" w:lineRule="auto"/>
+        <w:spacing w:line="360" w:lineRule="auto"/>
+        <w:rPr>
+          <w:rFonts w:ascii="Times New Roman" w:hAnsi="Times New Roman" w:cs="Times New Roman"/>
+        </w:rPr>
       </w:pPr>
       <m:oMathPara>
         <m:oMath>
           <m:r>
             <w:rPr>
-              <w:rFonts w:ascii="Cambria Math" w:hAnsi="Cambria Math"/>
+              <w:rFonts w:ascii="Cambria Math" w:hAnsi="Cambria Math" w:cs="Times New Roman"/>
             </w:rPr>
             <m:t>π=</m:t>
           </m:r>
@@ -2240,14 +2587,14 @@
               <m:chr m:val="∑"/>
               <m:ctrlPr>
                 <w:rPr>
-                  <w:rFonts w:ascii="Cambria Math" w:hAnsi="Cambria Math"/>
+                  <w:rFonts w:ascii="Cambria Math" w:hAnsi="Cambria Math" w:cs="Times New Roman"/>
                 </w:rPr>
               </m:ctrlPr>
             </m:naryPr>
             <m:sub>
               <m:r>
                 <w:rPr>
-                  <w:rFonts w:ascii="Cambria Math" w:hAnsi="Cambria Math"/>
+                  <w:rFonts w:ascii="Cambria Math" w:hAnsi="Cambria Math" w:cs="Times New Roman"/>
                 </w:rPr>
                 <m:t>k=0</m:t>
               </m:r>
@@ -2255,7 +2602,7 @@
             <m:sup>
               <m:r>
                 <w:rPr>
-                  <w:rFonts w:ascii="Cambria Math" w:hAnsi="Cambria Math"/>
+                  <w:rFonts w:ascii="Cambria Math" w:hAnsi="Cambria Math" w:cs="Times New Roman"/>
                 </w:rPr>
                 <m:t>∞</m:t>
               </m:r>
@@ -2265,14 +2612,14 @@
                 <m:fPr>
                   <m:ctrlPr>
                     <w:rPr>
-                      <w:rFonts w:ascii="Cambria Math" w:hAnsi="Cambria Math"/>
+                      <w:rFonts w:ascii="Cambria Math" w:hAnsi="Cambria Math" w:cs="Times New Roman"/>
                     </w:rPr>
                   </m:ctrlPr>
                 </m:fPr>
                 <m:num>
                   <m:r>
                     <w:rPr>
-                      <w:rFonts w:ascii="Cambria Math" w:hAnsi="Cambria Math"/>
+                      <w:rFonts w:ascii="Cambria Math" w:hAnsi="Cambria Math" w:cs="Times New Roman"/>
                     </w:rPr>
                     <m:t>1</m:t>
                   </m:r>
@@ -2282,14 +2629,14 @@
                     <m:sSupPr>
                       <m:ctrlPr>
                         <w:rPr>
-                          <w:rFonts w:ascii="Cambria Math" w:hAnsi="Cambria Math"/>
+                          <w:rFonts w:ascii="Cambria Math" w:hAnsi="Cambria Math" w:cs="Times New Roman"/>
                         </w:rPr>
                       </m:ctrlPr>
                     </m:sSupPr>
                     <m:e>
                       <m:r>
                         <w:rPr>
-                          <w:rFonts w:ascii="Cambria Math" w:hAnsi="Cambria Math"/>
+                          <w:rFonts w:ascii="Cambria Math" w:hAnsi="Cambria Math" w:cs="Times New Roman"/>
                         </w:rPr>
                         <m:t>16</m:t>
                       </m:r>
@@ -2297,7 +2644,7 @@
                     <m:sup>
                       <m:r>
                         <w:rPr>
-                          <w:rFonts w:ascii="Cambria Math" w:hAnsi="Cambria Math"/>
+                          <w:rFonts w:ascii="Cambria Math" w:hAnsi="Cambria Math" w:cs="Times New Roman"/>
                         </w:rPr>
                         <m:t>k</m:t>
                       </m:r>
@@ -2309,7 +2656,7 @@
                 <m:dPr>
                   <m:ctrlPr>
                     <w:rPr>
-                      <w:rFonts w:ascii="Cambria Math" w:hAnsi="Cambria Math"/>
+                      <w:rFonts w:ascii="Cambria Math" w:hAnsi="Cambria Math" w:cs="Times New Roman"/>
                     </w:rPr>
                   </m:ctrlPr>
                 </m:dPr>
@@ -2318,14 +2665,14 @@
                     <m:fPr>
                       <m:ctrlPr>
                         <w:rPr>
-                          <w:rFonts w:ascii="Cambria Math" w:hAnsi="Cambria Math"/>
+                          <w:rFonts w:ascii="Cambria Math" w:hAnsi="Cambria Math" w:cs="Times New Roman"/>
                         </w:rPr>
                       </m:ctrlPr>
                     </m:fPr>
                     <m:num>
                       <m:r>
                         <w:rPr>
-                          <w:rFonts w:ascii="Cambria Math" w:hAnsi="Cambria Math"/>
+                          <w:rFonts w:ascii="Cambria Math" w:hAnsi="Cambria Math" w:cs="Times New Roman"/>
                         </w:rPr>
                         <m:t>4</m:t>
                       </m:r>
@@ -2333,7 +2680,7 @@
                     <m:den>
                       <m:r>
                         <w:rPr>
-                          <w:rFonts w:ascii="Cambria Math" w:hAnsi="Cambria Math"/>
+                          <w:rFonts w:ascii="Cambria Math" w:hAnsi="Cambria Math" w:cs="Times New Roman"/>
                         </w:rPr>
                         <m:t>8k+1</m:t>
                       </m:r>
@@ -2341,7 +2688,7 @@
                   </m:f>
                   <m:r>
                     <w:rPr>
-                      <w:rFonts w:ascii="Cambria Math" w:hAnsi="Cambria Math"/>
+                      <w:rFonts w:ascii="Cambria Math" w:hAnsi="Cambria Math" w:cs="Times New Roman"/>
                     </w:rPr>
                     <m:t>-</m:t>
                   </m:r>
@@ -2349,14 +2696,14 @@
                     <m:fPr>
                       <m:ctrlPr>
                         <w:rPr>
-                          <w:rFonts w:ascii="Cambria Math" w:hAnsi="Cambria Math"/>
+                          <w:rFonts w:ascii="Cambria Math" w:hAnsi="Cambria Math" w:cs="Times New Roman"/>
                         </w:rPr>
                       </m:ctrlPr>
                     </m:fPr>
                     <m:num>
                       <m:r>
                         <w:rPr>
-                          <w:rFonts w:ascii="Cambria Math" w:hAnsi="Cambria Math"/>
+                          <w:rFonts w:ascii="Cambria Math" w:hAnsi="Cambria Math" w:cs="Times New Roman"/>
                         </w:rPr>
                         <m:t>2</m:t>
                       </m:r>
@@ -2364,7 +2711,7 @@
                     <m:den>
                       <m:r>
                         <w:rPr>
-                          <w:rFonts w:ascii="Cambria Math" w:hAnsi="Cambria Math"/>
+                          <w:rFonts w:ascii="Cambria Math" w:hAnsi="Cambria Math" w:cs="Times New Roman"/>
                         </w:rPr>
                         <m:t>8k+4</m:t>
                       </m:r>
@@ -2372,7 +2719,7 @@
                   </m:f>
                   <m:r>
                     <w:rPr>
-                      <w:rFonts w:ascii="Cambria Math" w:hAnsi="Cambria Math"/>
+                      <w:rFonts w:ascii="Cambria Math" w:hAnsi="Cambria Math" w:cs="Times New Roman"/>
                     </w:rPr>
                     <m:t>-</m:t>
                   </m:r>
@@ -2380,14 +2727,14 @@
                     <m:fPr>
                       <m:ctrlPr>
                         <w:rPr>
-                          <w:rFonts w:ascii="Cambria Math" w:hAnsi="Cambria Math"/>
+                          <w:rFonts w:ascii="Cambria Math" w:hAnsi="Cambria Math" w:cs="Times New Roman"/>
                         </w:rPr>
                       </m:ctrlPr>
                     </m:fPr>
                     <m:num>
                       <m:r>
                         <w:rPr>
-                          <w:rFonts w:ascii="Cambria Math" w:hAnsi="Cambria Math"/>
+                          <w:rFonts w:ascii="Cambria Math" w:hAnsi="Cambria Math" w:cs="Times New Roman"/>
                         </w:rPr>
                         <m:t>1</m:t>
                       </m:r>
@@ -2395,7 +2742,7 @@
                     <m:den>
                       <m:r>
                         <w:rPr>
-                          <w:rFonts w:ascii="Cambria Math" w:hAnsi="Cambria Math"/>
+                          <w:rFonts w:ascii="Cambria Math" w:hAnsi="Cambria Math" w:cs="Times New Roman"/>
                         </w:rPr>
                         <m:t>8k+5</m:t>
                       </m:r>
@@ -2403,7 +2750,7 @@
                   </m:f>
                   <m:r>
                     <w:rPr>
-                      <w:rFonts w:ascii="Cambria Math" w:hAnsi="Cambria Math"/>
+                      <w:rFonts w:ascii="Cambria Math" w:hAnsi="Cambria Math" w:cs="Times New Roman"/>
                     </w:rPr>
                     <m:t>-</m:t>
                   </m:r>
@@ -2411,14 +2758,14 @@
                     <m:fPr>
                       <m:ctrlPr>
                         <w:rPr>
-                          <w:rFonts w:ascii="Cambria Math" w:hAnsi="Cambria Math"/>
+                          <w:rFonts w:ascii="Cambria Math" w:hAnsi="Cambria Math" w:cs="Times New Roman"/>
                         </w:rPr>
                       </m:ctrlPr>
                     </m:fPr>
                     <m:num>
                       <m:r>
                         <w:rPr>
-                          <w:rFonts w:ascii="Cambria Math" w:hAnsi="Cambria Math"/>
+                          <w:rFonts w:ascii="Cambria Math" w:hAnsi="Cambria Math" w:cs="Times New Roman"/>
                         </w:rPr>
                         <m:t>1</m:t>
                       </m:r>
@@ -2426,7 +2773,7 @@
                     <m:den>
                       <m:r>
                         <w:rPr>
-                          <w:rFonts w:ascii="Cambria Math" w:hAnsi="Cambria Math"/>
+                          <w:rFonts w:ascii="Cambria Math" w:hAnsi="Cambria Math" w:cs="Times New Roman"/>
                         </w:rPr>
                         <m:t>8k+6</m:t>
                       </m:r>
@@ -2441,89 +2788,103 @@
     </w:p>
     <w:p>
       <w:pPr>
-        <w:spacing w:after="240" w:line="360" w:lineRule="auto"/>
-      </w:pPr>
-      <w:r>
-        <w:rPr>
-          <w:rFonts w:ascii="Calibri" w:eastAsia="Calibri" w:hAnsi="Calibri" w:cs="Calibri"/>
+        <w:spacing w:line="360" w:lineRule="auto"/>
+        <w:rPr>
+          <w:rFonts w:ascii="Times New Roman" w:hAnsi="Times New Roman" w:cs="Times New Roman"/>
+        </w:rPr>
+      </w:pPr>
+      <w:r>
+        <w:rPr>
+          <w:rFonts w:ascii="Times New Roman" w:eastAsia="Calibri" w:hAnsi="Times New Roman" w:cs="Times New Roman"/>
         </w:rPr>
         <w:t xml:space="preserve">En este programa, el algoritmo no se utiliza para imprimir el número $\pi$ como tal, sino como un motor de extracción de valores </w:t>
       </w:r>
       <w:proofErr w:type="spellStart"/>
       <w:r>
         <w:rPr>
-          <w:rFonts w:ascii="Calibri" w:eastAsia="Calibri" w:hAnsi="Calibri" w:cs="Calibri"/>
+          <w:rFonts w:ascii="Times New Roman" w:eastAsia="Calibri" w:hAnsi="Times New Roman" w:cs="Times New Roman"/>
         </w:rPr>
         <w:t>pseudo-aleatorios</w:t>
       </w:r>
       <w:proofErr w:type="spellEnd"/>
       <w:r>
         <w:rPr>
-          <w:rFonts w:ascii="Calibri" w:eastAsia="Calibri" w:hAnsi="Calibri" w:cs="Calibri"/>
+          <w:rFonts w:ascii="Times New Roman" w:eastAsia="Calibri" w:hAnsi="Times New Roman" w:cs="Times New Roman"/>
         </w:rPr>
         <w:t xml:space="preserve"> y deterministas. Dado que los dígitos de $\pi$ se comportan de manera uniforme y carecen de patrones predecibles, introducen una excelente fuente de desorden (entropía) para modificar el estado del generador numérico.</w:t>
       </w:r>
     </w:p>
     <w:p>
       <w:pPr>
-        <w:spacing w:after="240" w:line="360" w:lineRule="auto"/>
-        <w:rPr>
-          <w:rFonts w:ascii="Calibri" w:eastAsia="Calibri" w:hAnsi="Calibri" w:cs="Calibri"/>
+        <w:spacing w:line="360" w:lineRule="auto"/>
+        <w:rPr>
+          <w:rFonts w:ascii="Times New Roman" w:eastAsia="Calibri" w:hAnsi="Times New Roman" w:cs="Times New Roman"/>
         </w:rPr>
       </w:pPr>
     </w:p>
     <w:p>
       <w:pPr>
         <w:pStyle w:val="Ttulo2"/>
-        <w:spacing w:before="0" w:after="299" w:line="360" w:lineRule="auto"/>
-        <w:rPr>
-          <w:rFonts w:ascii="Calibri" w:eastAsia="Calibri" w:hAnsi="Calibri" w:cs="Calibri"/>
+        <w:numPr>
+          <w:ilvl w:val="1"/>
+          <w:numId w:val="9"/>
+        </w:numPr>
+        <w:spacing w:before="0" w:after="0" w:line="360" w:lineRule="auto"/>
+        <w:ind w:left="357" w:hanging="357"/>
+        <w:rPr>
+          <w:rFonts w:ascii="Times New Roman" w:eastAsia="Arial" w:hAnsi="Times New Roman" w:cs="Times New Roman"/>
+          <w:b/>
+          <w:color w:val="auto"/>
+          <w:sz w:val="22"/>
+          <w:szCs w:val="22"/>
+          <w:lang w:val="es-ES"/>
+        </w:rPr>
+      </w:pPr>
+      <w:r>
+        <w:rPr>
+          <w:rFonts w:ascii="Times New Roman" w:eastAsia="Arial" w:hAnsi="Times New Roman" w:cs="Times New Roman"/>
+          <w:b/>
+          <w:color w:val="auto"/>
+          <w:sz w:val="22"/>
+          <w:szCs w:val="22"/>
+          <w:lang w:val="es-ES"/>
+        </w:rPr>
+        <w:t>Explicación de Código por Funciones</w:t>
+      </w:r>
+    </w:p>
+    <w:p>
+      <w:pPr>
+        <w:pStyle w:val="Ttulo3"/>
+        <w:spacing w:before="0" w:after="0" w:line="360" w:lineRule="auto"/>
+        <w:rPr>
+          <w:rFonts w:ascii="Times New Roman" w:eastAsia="Consolas" w:hAnsi="Times New Roman" w:cs="Times New Roman"/>
           <w:b/>
           <w:bCs/>
           <w:color w:val="auto"/>
-          <w:sz w:val="36"/>
-          <w:szCs w:val="36"/>
-        </w:rPr>
-      </w:pPr>
-      <w:r>
-        <w:rPr>
-          <w:rFonts w:ascii="Calibri" w:eastAsia="Calibri" w:hAnsi="Calibri" w:cs="Calibri"/>
+          <w:sz w:val="22"/>
+          <w:szCs w:val="22"/>
+        </w:rPr>
+      </w:pPr>
+      <w:r>
+        <w:rPr>
+          <w:rFonts w:ascii="Times New Roman" w:eastAsia="Calibri" w:hAnsi="Times New Roman" w:cs="Times New Roman"/>
           <w:b/>
           <w:bCs/>
           <w:color w:val="auto"/>
-          <w:sz w:val="36"/>
-          <w:szCs w:val="36"/>
-        </w:rPr>
-        <w:t>2. Explicación de Código por Funciones</w:t>
-      </w:r>
-    </w:p>
-    <w:p>
-      <w:pPr>
-        <w:pStyle w:val="Ttulo3"/>
-        <w:spacing w:before="0" w:after="281" w:line="360" w:lineRule="auto"/>
-        <w:rPr>
-          <w:rFonts w:ascii="Consolas" w:eastAsia="Consolas" w:hAnsi="Consolas" w:cs="Consolas"/>
+          <w:sz w:val="22"/>
+          <w:szCs w:val="22"/>
+        </w:rPr>
+        <w:t xml:space="preserve">Función: </w:t>
+      </w:r>
+      <w:proofErr w:type="spellStart"/>
+      <w:r>
+        <w:rPr>
+          <w:rFonts w:ascii="Times New Roman" w:eastAsia="Consolas" w:hAnsi="Times New Roman" w:cs="Times New Roman"/>
           <w:b/>
           <w:bCs/>
           <w:color w:val="auto"/>
-        </w:rPr>
-      </w:pPr>
-      <w:r>
-        <w:rPr>
-          <w:rFonts w:ascii="Calibri" w:eastAsia="Calibri" w:hAnsi="Calibri" w:cs="Calibri"/>
-          <w:b/>
-          <w:bCs/>
-          <w:color w:val="auto"/>
-        </w:rPr>
-        <w:t xml:space="preserve">Función: </w:t>
-      </w:r>
-      <w:proofErr w:type="spellStart"/>
-      <w:r>
-        <w:rPr>
-          <w:rFonts w:ascii="Consolas" w:eastAsia="Consolas" w:hAnsi="Consolas" w:cs="Consolas"/>
-          <w:b/>
-          <w:bCs/>
-          <w:color w:val="auto"/>
+          <w:sz w:val="22"/>
+          <w:szCs w:val="22"/>
         </w:rPr>
         <w:t>calcularPotenciaModular</w:t>
       </w:r>
@@ -2536,14 +2897,14 @@
           <w:ilvl w:val="0"/>
           <w:numId w:val="29"/>
         </w:numPr>
-        <w:spacing w:after="240" w:line="360" w:lineRule="auto"/>
-        <w:rPr>
-          <w:rFonts w:ascii="Calibri" w:eastAsia="Calibri" w:hAnsi="Calibri" w:cs="Calibri"/>
-        </w:rPr>
-      </w:pPr>
-      <w:r>
-        <w:rPr>
-          <w:rFonts w:ascii="Calibri" w:eastAsia="Calibri" w:hAnsi="Calibri" w:cs="Calibri"/>
+        <w:spacing w:line="360" w:lineRule="auto"/>
+        <w:rPr>
+          <w:rFonts w:ascii="Times New Roman" w:eastAsia="Calibri" w:hAnsi="Times New Roman" w:cs="Times New Roman"/>
+        </w:rPr>
+      </w:pPr>
+      <w:r>
+        <w:rPr>
+          <w:rFonts w:ascii="Times New Roman" w:eastAsia="Calibri" w:hAnsi="Times New Roman" w:cs="Times New Roman"/>
           <w:b/>
           <w:bCs/>
         </w:rPr>
@@ -2551,7 +2912,7 @@
       </w:r>
       <w:r>
         <w:rPr>
-          <w:rFonts w:ascii="Calibri" w:eastAsia="Calibri" w:hAnsi="Calibri" w:cs="Calibri"/>
+          <w:rFonts w:ascii="Times New Roman" w:eastAsia="Calibri" w:hAnsi="Times New Roman" w:cs="Times New Roman"/>
         </w:rPr>
         <w:t xml:space="preserve"> Realiza una exponenciación modular rápida utilizando el método de exponenciación binaria.</w:t>
       </w:r>
@@ -2563,14 +2924,14 @@
           <w:ilvl w:val="0"/>
           <w:numId w:val="29"/>
         </w:numPr>
-        <w:spacing w:after="240" w:line="360" w:lineRule="auto"/>
-        <w:rPr>
-          <w:rFonts w:ascii="Calibri" w:eastAsia="Calibri" w:hAnsi="Calibri" w:cs="Calibri"/>
-        </w:rPr>
-      </w:pPr>
-      <w:r>
-        <w:rPr>
-          <w:rFonts w:ascii="Calibri" w:eastAsia="Calibri" w:hAnsi="Calibri" w:cs="Calibri"/>
+        <w:spacing w:line="360" w:lineRule="auto"/>
+        <w:rPr>
+          <w:rFonts w:ascii="Times New Roman" w:eastAsia="Calibri" w:hAnsi="Times New Roman" w:cs="Times New Roman"/>
+        </w:rPr>
+      </w:pPr>
+      <w:r>
+        <w:rPr>
+          <w:rFonts w:ascii="Times New Roman" w:eastAsia="Calibri" w:hAnsi="Times New Roman" w:cs="Times New Roman"/>
           <w:b/>
           <w:bCs/>
         </w:rPr>
@@ -2578,7 +2939,7 @@
       </w:r>
       <w:r>
         <w:rPr>
-          <w:rFonts w:ascii="Calibri" w:eastAsia="Calibri" w:hAnsi="Calibri" w:cs="Calibri"/>
+          <w:rFonts w:ascii="Times New Roman" w:eastAsia="Calibri" w:hAnsi="Times New Roman" w:cs="Times New Roman"/>
         </w:rPr>
         <w:t xml:space="preserve"> Al calcular términos de la serie BBP para posiciones muy grandes, las potencias de 16 causarían un desbordamiento aritmético instantáneo en cualquier tipo de variable estándar. Esta función previene ese error manteniendo los números acotados, aplicando el módulo en cada paso de la multiplicación.</w:t>
       </w:r>
@@ -2586,30 +2947,36 @@
     <w:p>
       <w:pPr>
         <w:pStyle w:val="Ttulo3"/>
-        <w:spacing w:before="0" w:after="281" w:line="360" w:lineRule="auto"/>
-        <w:rPr>
-          <w:rFonts w:ascii="Consolas" w:eastAsia="Consolas" w:hAnsi="Consolas" w:cs="Consolas"/>
+        <w:spacing w:before="0" w:after="0" w:line="360" w:lineRule="auto"/>
+        <w:rPr>
+          <w:rFonts w:ascii="Times New Roman" w:eastAsia="Consolas" w:hAnsi="Times New Roman" w:cs="Times New Roman"/>
           <w:b/>
           <w:bCs/>
           <w:color w:val="auto"/>
-        </w:rPr>
-      </w:pPr>
-      <w:r>
-        <w:rPr>
-          <w:rFonts w:ascii="Calibri" w:eastAsia="Calibri" w:hAnsi="Calibri" w:cs="Calibri"/>
+          <w:sz w:val="22"/>
+          <w:szCs w:val="22"/>
+        </w:rPr>
+      </w:pPr>
+      <w:r>
+        <w:rPr>
+          <w:rFonts w:ascii="Times New Roman" w:eastAsia="Calibri" w:hAnsi="Times New Roman" w:cs="Times New Roman"/>
           <w:b/>
           <w:bCs/>
           <w:color w:val="auto"/>
+          <w:sz w:val="22"/>
+          <w:szCs w:val="22"/>
         </w:rPr>
         <w:t xml:space="preserve">Función: </w:t>
       </w:r>
       <w:proofErr w:type="spellStart"/>
       <w:r>
         <w:rPr>
-          <w:rFonts w:ascii="Consolas" w:eastAsia="Consolas" w:hAnsi="Consolas" w:cs="Consolas"/>
+          <w:rFonts w:ascii="Times New Roman" w:eastAsia="Consolas" w:hAnsi="Times New Roman" w:cs="Times New Roman"/>
           <w:b/>
           <w:bCs/>
           <w:color w:val="auto"/>
+          <w:sz w:val="22"/>
+          <w:szCs w:val="22"/>
         </w:rPr>
         <w:t>calcularSerieBBP</w:t>
       </w:r>
@@ -2622,14 +2989,14 @@
           <w:ilvl w:val="0"/>
           <w:numId w:val="28"/>
         </w:numPr>
-        <w:spacing w:after="240" w:line="360" w:lineRule="auto"/>
-        <w:rPr>
-          <w:rFonts w:ascii="Calibri" w:eastAsia="Calibri" w:hAnsi="Calibri" w:cs="Calibri"/>
-        </w:rPr>
-      </w:pPr>
-      <w:r>
-        <w:rPr>
-          <w:rFonts w:ascii="Calibri" w:eastAsia="Calibri" w:hAnsi="Calibri" w:cs="Calibri"/>
+        <w:spacing w:line="360" w:lineRule="auto"/>
+        <w:rPr>
+          <w:rFonts w:ascii="Times New Roman" w:eastAsia="Calibri" w:hAnsi="Times New Roman" w:cs="Times New Roman"/>
+        </w:rPr>
+      </w:pPr>
+      <w:r>
+        <w:rPr>
+          <w:rFonts w:ascii="Times New Roman" w:eastAsia="Calibri" w:hAnsi="Times New Roman" w:cs="Times New Roman"/>
           <w:b/>
           <w:bCs/>
         </w:rPr>
@@ -2637,7 +3004,7 @@
       </w:r>
       <w:r>
         <w:rPr>
-          <w:rFonts w:ascii="Calibri" w:eastAsia="Calibri" w:hAnsi="Calibri" w:cs="Calibri"/>
+          <w:rFonts w:ascii="Times New Roman" w:eastAsia="Calibri" w:hAnsi="Times New Roman" w:cs="Times New Roman"/>
         </w:rPr>
         <w:t xml:space="preserve"> Evalúa la sumatoria fraccionaria de la serie BBP para un denominador específico (de la forma 8k + j) evaluado en la posición solicitada.</w:t>
       </w:r>
@@ -2649,23 +3016,22 @@
           <w:ilvl w:val="0"/>
           <w:numId w:val="28"/>
         </w:numPr>
-        <w:spacing w:before="240" w:after="240" w:line="360" w:lineRule="auto"/>
-        <w:rPr>
-          <w:rFonts w:ascii="Calibri" w:eastAsia="Calibri" w:hAnsi="Calibri" w:cs="Calibri"/>
-        </w:rPr>
-      </w:pPr>
-      <w:r>
-        <w:rPr>
-          <w:rFonts w:ascii="Calibri" w:eastAsia="Calibri" w:hAnsi="Calibri" w:cs="Calibri"/>
+        <w:spacing w:line="360" w:lineRule="auto"/>
+        <w:rPr>
+          <w:rFonts w:ascii="Times New Roman" w:eastAsia="Calibri" w:hAnsi="Times New Roman" w:cs="Times New Roman"/>
+        </w:rPr>
+      </w:pPr>
+      <w:r>
+        <w:rPr>
+          <w:rFonts w:ascii="Times New Roman" w:eastAsia="Calibri" w:hAnsi="Times New Roman" w:cs="Times New Roman"/>
           <w:b/>
           <w:bCs/>
         </w:rPr>
-        <w:lastRenderedPageBreak/>
         <w:t>Funcionamiento:</w:t>
       </w:r>
       <w:r>
         <w:rPr>
-          <w:rFonts w:ascii="Calibri" w:eastAsia="Calibri" w:hAnsi="Calibri" w:cs="Calibri"/>
+          <w:rFonts w:ascii="Times New Roman" w:eastAsia="Calibri" w:hAnsi="Times New Roman" w:cs="Times New Roman"/>
         </w:rPr>
         <w:t xml:space="preserve"> Divide el cálculo matemático en dos etapas para garantizar la precisión:</w:t>
       </w:r>
@@ -2677,14 +3043,14 @@
           <w:ilvl w:val="1"/>
           <w:numId w:val="28"/>
         </w:numPr>
-        <w:spacing w:before="240" w:after="240" w:line="360" w:lineRule="auto"/>
-        <w:rPr>
-          <w:rFonts w:ascii="Calibri" w:eastAsia="Calibri" w:hAnsi="Calibri" w:cs="Calibri"/>
-        </w:rPr>
-      </w:pPr>
-      <w:r>
-        <w:rPr>
-          <w:rFonts w:ascii="Calibri" w:eastAsia="Calibri" w:hAnsi="Calibri" w:cs="Calibri"/>
+        <w:spacing w:line="360" w:lineRule="auto"/>
+        <w:rPr>
+          <w:rFonts w:ascii="Times New Roman" w:eastAsia="Calibri" w:hAnsi="Times New Roman" w:cs="Times New Roman"/>
+        </w:rPr>
+      </w:pPr>
+      <w:r>
+        <w:rPr>
+          <w:rFonts w:ascii="Times New Roman" w:eastAsia="Calibri" w:hAnsi="Times New Roman" w:cs="Times New Roman"/>
         </w:rPr>
         <w:t>Un primer ciclo calcula los términos donde el exponente es positivo, apoyándose en la función de potencia modular para extraer de manera eficiente solo la parte fraccionaria.</w:t>
       </w:r>
@@ -2696,14 +3062,14 @@
           <w:ilvl w:val="1"/>
           <w:numId w:val="28"/>
         </w:numPr>
-        <w:spacing w:before="240" w:after="240" w:line="360" w:lineRule="auto"/>
-        <w:rPr>
-          <w:rFonts w:ascii="Calibri" w:eastAsia="Calibri" w:hAnsi="Calibri" w:cs="Calibri"/>
-        </w:rPr>
-      </w:pPr>
-      <w:r>
-        <w:rPr>
-          <w:rFonts w:ascii="Calibri" w:eastAsia="Calibri" w:hAnsi="Calibri" w:cs="Calibri"/>
+        <w:spacing w:line="360" w:lineRule="auto"/>
+        <w:rPr>
+          <w:rFonts w:ascii="Times New Roman" w:eastAsia="Calibri" w:hAnsi="Times New Roman" w:cs="Times New Roman"/>
+        </w:rPr>
+      </w:pPr>
+      <w:r>
+        <w:rPr>
+          <w:rFonts w:ascii="Times New Roman" w:eastAsia="Calibri" w:hAnsi="Times New Roman" w:cs="Times New Roman"/>
         </w:rPr>
         <w:t>Un segundo ciclo suma los términos con exponentes negativos, donde la potencia de 16 se vuelve una fracción muy pequeña, aportando la precisión decimal necesaria sin riesgo de desbordamiento.</w:t>
       </w:r>
@@ -2711,24 +3077,33 @@
     <w:p>
       <w:pPr>
         <w:pStyle w:val="Ttulo3"/>
-        <w:spacing w:before="281" w:after="281" w:line="360" w:lineRule="auto"/>
-      </w:pPr>
-      <w:r>
-        <w:rPr>
-          <w:rFonts w:ascii="Calibri" w:eastAsia="Calibri" w:hAnsi="Calibri" w:cs="Calibri"/>
+        <w:spacing w:before="0" w:after="0" w:line="360" w:lineRule="auto"/>
+        <w:rPr>
+          <w:rFonts w:ascii="Times New Roman" w:hAnsi="Times New Roman" w:cs="Times New Roman"/>
+          <w:sz w:val="22"/>
+          <w:szCs w:val="22"/>
+        </w:rPr>
+      </w:pPr>
+      <w:r>
+        <w:rPr>
+          <w:rFonts w:ascii="Times New Roman" w:eastAsia="Calibri" w:hAnsi="Times New Roman" w:cs="Times New Roman"/>
           <w:b/>
           <w:bCs/>
           <w:color w:val="auto"/>
+          <w:sz w:val="22"/>
+          <w:szCs w:val="22"/>
         </w:rPr>
         <w:t xml:space="preserve">Función: </w:t>
       </w:r>
       <w:proofErr w:type="spellStart"/>
       <w:r>
         <w:rPr>
-          <w:rFonts w:ascii="Consolas" w:eastAsia="Consolas" w:hAnsi="Consolas" w:cs="Consolas"/>
+          <w:rFonts w:ascii="Times New Roman" w:eastAsia="Consolas" w:hAnsi="Times New Roman" w:cs="Times New Roman"/>
           <w:b/>
           <w:bCs/>
           <w:color w:val="auto"/>
+          <w:sz w:val="22"/>
+          <w:szCs w:val="22"/>
         </w:rPr>
         <w:t>obtenerDigitoPi</w:t>
       </w:r>
@@ -2741,14 +3116,14 @@
           <w:ilvl w:val="0"/>
           <w:numId w:val="30"/>
         </w:numPr>
-        <w:spacing w:before="240" w:after="240" w:line="360" w:lineRule="auto"/>
-        <w:rPr>
-          <w:rFonts w:ascii="Calibri" w:eastAsia="Calibri" w:hAnsi="Calibri" w:cs="Calibri"/>
-        </w:rPr>
-      </w:pPr>
-      <w:r>
-        <w:rPr>
-          <w:rFonts w:ascii="Calibri" w:eastAsia="Calibri" w:hAnsi="Calibri" w:cs="Calibri"/>
+        <w:spacing w:line="360" w:lineRule="auto"/>
+        <w:rPr>
+          <w:rFonts w:ascii="Times New Roman" w:eastAsia="Calibri" w:hAnsi="Times New Roman" w:cs="Times New Roman"/>
+        </w:rPr>
+      </w:pPr>
+      <w:r>
+        <w:rPr>
+          <w:rFonts w:ascii="Times New Roman" w:eastAsia="Calibri" w:hAnsi="Times New Roman" w:cs="Times New Roman"/>
           <w:b/>
           <w:bCs/>
         </w:rPr>
@@ -2756,7 +3131,7 @@
       </w:r>
       <w:r>
         <w:rPr>
-          <w:rFonts w:ascii="Calibri" w:eastAsia="Calibri" w:hAnsi="Calibri" w:cs="Calibri"/>
+          <w:rFonts w:ascii="Times New Roman" w:eastAsia="Calibri" w:hAnsi="Times New Roman" w:cs="Times New Roman"/>
         </w:rPr>
         <w:t xml:space="preserve"> Es la función coordinadora que halla el dígito final combinando los resultados matemáticos.</w:t>
       </w:r>
@@ -2768,36 +3143,37 @@
           <w:ilvl w:val="0"/>
           <w:numId w:val="30"/>
         </w:numPr>
-        <w:spacing w:before="240" w:after="240" w:line="360" w:lineRule="auto"/>
-        <w:rPr>
-          <w:rFonts w:ascii="Calibri" w:eastAsia="Calibri" w:hAnsi="Calibri" w:cs="Calibri"/>
-        </w:rPr>
-      </w:pPr>
-      <w:r>
-        <w:rPr>
-          <w:rFonts w:ascii="Calibri" w:eastAsia="Calibri" w:hAnsi="Calibri" w:cs="Calibri"/>
+        <w:spacing w:line="360" w:lineRule="auto"/>
+        <w:rPr>
+          <w:rFonts w:ascii="Times New Roman" w:eastAsia="Calibri" w:hAnsi="Times New Roman" w:cs="Times New Roman"/>
+        </w:rPr>
+      </w:pPr>
+      <w:r>
+        <w:rPr>
+          <w:rFonts w:ascii="Times New Roman" w:eastAsia="Calibri" w:hAnsi="Times New Roman" w:cs="Times New Roman"/>
           <w:b/>
           <w:bCs/>
         </w:rPr>
+        <w:lastRenderedPageBreak/>
         <w:t>Funcionamiento:</w:t>
       </w:r>
       <w:r>
         <w:rPr>
-          <w:rFonts w:ascii="Calibri" w:eastAsia="Calibri" w:hAnsi="Calibri" w:cs="Calibri"/>
+          <w:rFonts w:ascii="Times New Roman" w:eastAsia="Calibri" w:hAnsi="Times New Roman" w:cs="Times New Roman"/>
         </w:rPr>
         <w:t xml:space="preserve"> Realiza cuatro llamadas a </w:t>
       </w:r>
       <w:proofErr w:type="spellStart"/>
       <w:r>
         <w:rPr>
-          <w:rFonts w:ascii="Consolas" w:eastAsia="Consolas" w:hAnsi="Consolas" w:cs="Consolas"/>
+          <w:rFonts w:ascii="Times New Roman" w:eastAsia="Consolas" w:hAnsi="Times New Roman" w:cs="Times New Roman"/>
         </w:rPr>
         <w:t>calcularSerieBBP</w:t>
       </w:r>
       <w:proofErr w:type="spellEnd"/>
       <w:r>
         <w:rPr>
-          <w:rFonts w:ascii="Calibri" w:eastAsia="Calibri" w:hAnsi="Calibri" w:cs="Calibri"/>
+          <w:rFonts w:ascii="Times New Roman" w:eastAsia="Calibri" w:hAnsi="Times New Roman" w:cs="Times New Roman"/>
         </w:rPr>
         <w:t xml:space="preserve"> con los coeficientes correspondientes a la fórmula original (1, 4, 5 y 6). Luego, extrae exclusivamente la parte fraccionaria de esa combinación, se asegura de que el valor sea positivo y lo multiplica por 16. Esto aísla el dígito hexadecimal exacto en la posición requerida, devolviéndolo como un número de 8 bits.</w:t>
       </w:r>
@@ -2805,30 +3181,36 @@
     <w:p>
       <w:pPr>
         <w:pStyle w:val="Ttulo3"/>
-        <w:spacing w:before="0" w:after="281" w:line="360" w:lineRule="auto"/>
-        <w:rPr>
-          <w:rFonts w:ascii="Consolas" w:eastAsia="Consolas" w:hAnsi="Consolas" w:cs="Consolas"/>
+        <w:spacing w:before="0" w:after="0" w:line="360" w:lineRule="auto"/>
+        <w:rPr>
+          <w:rFonts w:ascii="Times New Roman" w:eastAsia="Consolas" w:hAnsi="Times New Roman" w:cs="Times New Roman"/>
           <w:b/>
           <w:bCs/>
           <w:color w:val="auto"/>
-        </w:rPr>
-      </w:pPr>
-      <w:r>
-        <w:rPr>
-          <w:rFonts w:ascii="Calibri" w:eastAsia="Calibri" w:hAnsi="Calibri" w:cs="Calibri"/>
+          <w:sz w:val="22"/>
+          <w:szCs w:val="22"/>
+        </w:rPr>
+      </w:pPr>
+      <w:r>
+        <w:rPr>
+          <w:rFonts w:ascii="Times New Roman" w:eastAsia="Calibri" w:hAnsi="Times New Roman" w:cs="Times New Roman"/>
           <w:b/>
           <w:bCs/>
           <w:color w:val="auto"/>
+          <w:sz w:val="22"/>
+          <w:szCs w:val="22"/>
         </w:rPr>
         <w:t xml:space="preserve">Función: </w:t>
       </w:r>
       <w:proofErr w:type="spellStart"/>
       <w:r>
         <w:rPr>
-          <w:rFonts w:ascii="Consolas" w:eastAsia="Consolas" w:hAnsi="Consolas" w:cs="Consolas"/>
+          <w:rFonts w:ascii="Times New Roman" w:eastAsia="Consolas" w:hAnsi="Times New Roman" w:cs="Times New Roman"/>
           <w:b/>
           <w:bCs/>
           <w:color w:val="auto"/>
+          <w:sz w:val="22"/>
+          <w:szCs w:val="22"/>
         </w:rPr>
         <w:t>mezclarEstado</w:t>
       </w:r>
@@ -2841,14 +3223,14 @@
           <w:ilvl w:val="0"/>
           <w:numId w:val="27"/>
         </w:numPr>
-        <w:spacing w:after="240" w:line="360" w:lineRule="auto"/>
-        <w:rPr>
-          <w:rFonts w:ascii="Calibri" w:eastAsia="Calibri" w:hAnsi="Calibri" w:cs="Calibri"/>
-        </w:rPr>
-      </w:pPr>
-      <w:r>
-        <w:rPr>
-          <w:rFonts w:ascii="Calibri" w:eastAsia="Calibri" w:hAnsi="Calibri" w:cs="Calibri"/>
+        <w:spacing w:line="360" w:lineRule="auto"/>
+        <w:rPr>
+          <w:rFonts w:ascii="Times New Roman" w:eastAsia="Calibri" w:hAnsi="Times New Roman" w:cs="Times New Roman"/>
+        </w:rPr>
+      </w:pPr>
+      <w:r>
+        <w:rPr>
+          <w:rFonts w:ascii="Times New Roman" w:eastAsia="Calibri" w:hAnsi="Times New Roman" w:cs="Times New Roman"/>
           <w:b/>
           <w:bCs/>
         </w:rPr>
@@ -2856,7 +3238,7 @@
       </w:r>
       <w:r>
         <w:rPr>
-          <w:rFonts w:ascii="Calibri" w:eastAsia="Calibri" w:hAnsi="Calibri" w:cs="Calibri"/>
+          <w:rFonts w:ascii="Times New Roman" w:eastAsia="Calibri" w:hAnsi="Times New Roman" w:cs="Times New Roman"/>
         </w:rPr>
         <w:t xml:space="preserve"> Aplicar difusión y confusión al estado interno del generador para asegurar la aleatoriedad.</w:t>
       </w:r>
@@ -2868,14 +3250,14 @@
           <w:ilvl w:val="0"/>
           <w:numId w:val="27"/>
         </w:numPr>
-        <w:spacing w:after="240" w:line="360" w:lineRule="auto"/>
-        <w:rPr>
-          <w:rFonts w:ascii="Calibri" w:eastAsia="Calibri" w:hAnsi="Calibri" w:cs="Calibri"/>
-        </w:rPr>
-      </w:pPr>
-      <w:r>
-        <w:rPr>
-          <w:rFonts w:ascii="Calibri" w:eastAsia="Calibri" w:hAnsi="Calibri" w:cs="Calibri"/>
+        <w:spacing w:line="360" w:lineRule="auto"/>
+        <w:rPr>
+          <w:rFonts w:ascii="Times New Roman" w:eastAsia="Calibri" w:hAnsi="Times New Roman" w:cs="Times New Roman"/>
+        </w:rPr>
+      </w:pPr>
+      <w:r>
+        <w:rPr>
+          <w:rFonts w:ascii="Times New Roman" w:eastAsia="Calibri" w:hAnsi="Times New Roman" w:cs="Times New Roman"/>
           <w:b/>
           <w:bCs/>
         </w:rPr>
@@ -2883,45 +3265,45 @@
       </w:r>
       <w:r>
         <w:rPr>
-          <w:rFonts w:ascii="Calibri" w:eastAsia="Calibri" w:hAnsi="Calibri" w:cs="Calibri"/>
+          <w:rFonts w:ascii="Times New Roman" w:eastAsia="Calibri" w:hAnsi="Times New Roman" w:cs="Times New Roman"/>
         </w:rPr>
         <w:t xml:space="preserve"> Modifica el estado actual aplicando un operador lógico XOR (</w:t>
       </w:r>
       <w:r>
         <w:rPr>
-          <w:rFonts w:ascii="Consolas" w:eastAsia="Consolas" w:hAnsi="Consolas" w:cs="Consolas"/>
+          <w:rFonts w:ascii="Times New Roman" w:eastAsia="Consolas" w:hAnsi="Times New Roman" w:cs="Times New Roman"/>
         </w:rPr>
         <w:t>^</w:t>
       </w:r>
       <w:r>
         <w:rPr>
-          <w:rFonts w:ascii="Calibri" w:eastAsia="Calibri" w:hAnsi="Calibri" w:cs="Calibri"/>
+          <w:rFonts w:ascii="Times New Roman" w:eastAsia="Calibri" w:hAnsi="Times New Roman" w:cs="Times New Roman"/>
         </w:rPr>
         <w:t xml:space="preserve">) junto con una versión de sí mismo desplazada a la derecha según los bits indicados por el usuario. Luego, le suma el dígito de </w:t>
       </w:r>
       <m:oMath>
         <m:r>
           <w:rPr>
-            <w:rFonts w:ascii="Cambria Math" w:hAnsi="Cambria Math"/>
+            <w:rFonts w:ascii="Cambria Math" w:hAnsi="Cambria Math" w:cs="Times New Roman"/>
           </w:rPr>
           <m:t>π</m:t>
         </m:r>
       </m:oMath>
       <w:r>
         <w:rPr>
-          <w:rFonts w:ascii="Calibri" w:eastAsia="Calibri" w:hAnsi="Calibri" w:cs="Calibri"/>
+          <w:rFonts w:ascii="Times New Roman" w:eastAsia="Calibri" w:hAnsi="Times New Roman" w:cs="Times New Roman"/>
         </w:rPr>
         <w:t xml:space="preserve"> extraído y finalmente aplica una negación bit a bit (</w:t>
       </w:r>
       <w:r>
         <w:rPr>
-          <w:rFonts w:ascii="Consolas" w:eastAsia="Consolas" w:hAnsi="Consolas" w:cs="Consolas"/>
+          <w:rFonts w:ascii="Times New Roman" w:eastAsia="Consolas" w:hAnsi="Times New Roman" w:cs="Times New Roman"/>
         </w:rPr>
         <w:t>~</w:t>
       </w:r>
       <w:r>
         <w:rPr>
-          <w:rFonts w:ascii="Calibri" w:eastAsia="Calibri" w:hAnsi="Calibri" w:cs="Calibri"/>
+          <w:rFonts w:ascii="Times New Roman" w:eastAsia="Calibri" w:hAnsi="Times New Roman" w:cs="Times New Roman"/>
         </w:rPr>
         <w:t>). Esto invierte todos los bits, maximizando la dispersión de los datos y corrompiendo el estado de manera irreversible.</w:t>
       </w:r>
@@ -2929,30 +3311,36 @@
     <w:p>
       <w:pPr>
         <w:pStyle w:val="Ttulo3"/>
-        <w:spacing w:before="0" w:after="281" w:line="360" w:lineRule="auto"/>
-        <w:rPr>
-          <w:rFonts w:ascii="Consolas" w:eastAsia="Consolas" w:hAnsi="Consolas" w:cs="Consolas"/>
+        <w:spacing w:before="0" w:after="0" w:line="360" w:lineRule="auto"/>
+        <w:rPr>
+          <w:rFonts w:ascii="Times New Roman" w:eastAsia="Consolas" w:hAnsi="Times New Roman" w:cs="Times New Roman"/>
           <w:b/>
           <w:bCs/>
           <w:color w:val="auto"/>
-        </w:rPr>
-      </w:pPr>
-      <w:r>
-        <w:rPr>
-          <w:rFonts w:ascii="Calibri" w:eastAsia="Calibri" w:hAnsi="Calibri" w:cs="Calibri"/>
+          <w:sz w:val="22"/>
+          <w:szCs w:val="22"/>
+        </w:rPr>
+      </w:pPr>
+      <w:r>
+        <w:rPr>
+          <w:rFonts w:ascii="Times New Roman" w:eastAsia="Calibri" w:hAnsi="Times New Roman" w:cs="Times New Roman"/>
           <w:b/>
           <w:bCs/>
           <w:color w:val="auto"/>
+          <w:sz w:val="22"/>
+          <w:szCs w:val="22"/>
         </w:rPr>
         <w:t xml:space="preserve">Función: </w:t>
       </w:r>
       <w:proofErr w:type="spellStart"/>
       <w:r>
         <w:rPr>
-          <w:rFonts w:ascii="Consolas" w:eastAsia="Consolas" w:hAnsi="Consolas" w:cs="Consolas"/>
+          <w:rFonts w:ascii="Times New Roman" w:eastAsia="Consolas" w:hAnsi="Times New Roman" w:cs="Times New Roman"/>
           <w:b/>
           <w:bCs/>
           <w:color w:val="auto"/>
+          <w:sz w:val="22"/>
+          <w:szCs w:val="22"/>
         </w:rPr>
         <w:t>aplicarLimite</w:t>
       </w:r>
@@ -2965,14 +3353,14 @@
           <w:ilvl w:val="0"/>
           <w:numId w:val="26"/>
         </w:numPr>
-        <w:spacing w:after="240" w:line="360" w:lineRule="auto"/>
-        <w:rPr>
-          <w:rFonts w:ascii="Calibri" w:eastAsia="Calibri" w:hAnsi="Calibri" w:cs="Calibri"/>
-        </w:rPr>
-      </w:pPr>
-      <w:r>
-        <w:rPr>
-          <w:rFonts w:ascii="Calibri" w:eastAsia="Calibri" w:hAnsi="Calibri" w:cs="Calibri"/>
+        <w:spacing w:line="360" w:lineRule="auto"/>
+        <w:rPr>
+          <w:rFonts w:ascii="Times New Roman" w:eastAsia="Calibri" w:hAnsi="Times New Roman" w:cs="Times New Roman"/>
+        </w:rPr>
+      </w:pPr>
+      <w:r>
+        <w:rPr>
+          <w:rFonts w:ascii="Times New Roman" w:eastAsia="Calibri" w:hAnsi="Times New Roman" w:cs="Times New Roman"/>
           <w:b/>
           <w:bCs/>
         </w:rPr>
@@ -2980,7 +3368,7 @@
       </w:r>
       <w:r>
         <w:rPr>
-          <w:rFonts w:ascii="Calibri" w:eastAsia="Calibri" w:hAnsi="Calibri" w:cs="Calibri"/>
+          <w:rFonts w:ascii="Times New Roman" w:eastAsia="Calibri" w:hAnsi="Times New Roman" w:cs="Times New Roman"/>
         </w:rPr>
         <w:t xml:space="preserve"> Restringe el valor numérico generado para que encaje dentro del rango deseado por el usuario.</w:t>
       </w:r>
@@ -2992,23 +3380,22 @@
           <w:ilvl w:val="0"/>
           <w:numId w:val="26"/>
         </w:numPr>
-        <w:spacing w:after="240" w:line="360" w:lineRule="auto"/>
-        <w:rPr>
-          <w:rFonts w:ascii="Calibri" w:eastAsia="Calibri" w:hAnsi="Calibri" w:cs="Calibri"/>
-        </w:rPr>
-      </w:pPr>
-      <w:r>
-        <w:rPr>
-          <w:rFonts w:ascii="Calibri" w:eastAsia="Calibri" w:hAnsi="Calibri" w:cs="Calibri"/>
+        <w:spacing w:line="360" w:lineRule="auto"/>
+        <w:rPr>
+          <w:rFonts w:ascii="Times New Roman" w:eastAsia="Calibri" w:hAnsi="Times New Roman" w:cs="Times New Roman"/>
+        </w:rPr>
+      </w:pPr>
+      <w:r>
+        <w:rPr>
+          <w:rFonts w:ascii="Times New Roman" w:eastAsia="Calibri" w:hAnsi="Times New Roman" w:cs="Times New Roman"/>
           <w:b/>
           <w:bCs/>
         </w:rPr>
-        <w:lastRenderedPageBreak/>
         <w:t>Funcionamiento:</w:t>
       </w:r>
       <w:r>
         <w:rPr>
-          <w:rFonts w:ascii="Calibri" w:eastAsia="Calibri" w:hAnsi="Calibri" w:cs="Calibri"/>
+          <w:rFonts w:ascii="Times New Roman" w:eastAsia="Calibri" w:hAnsi="Times New Roman" w:cs="Times New Roman"/>
         </w:rPr>
         <w:t xml:space="preserve"> Verifica que el límite no sea cero (para evitar errores de división) y retorna el residuo de la división entre el estado actual y el límite superior.</w:t>
       </w:r>
@@ -3016,59 +3403,67 @@
     <w:p>
       <w:pPr>
         <w:pStyle w:val="Ttulo2"/>
-        <w:spacing w:before="0" w:after="299" w:line="360" w:lineRule="auto"/>
-        <w:rPr>
-          <w:rFonts w:ascii="Calibri" w:eastAsia="Calibri" w:hAnsi="Calibri" w:cs="Calibri"/>
-          <w:b/>
-          <w:bCs/>
+        <w:numPr>
+          <w:ilvl w:val="1"/>
+          <w:numId w:val="9"/>
+        </w:numPr>
+        <w:spacing w:before="0" w:after="0" w:line="360" w:lineRule="auto"/>
+        <w:ind w:left="357" w:hanging="357"/>
+        <w:rPr>
+          <w:rFonts w:ascii="Times New Roman" w:eastAsia="Arial" w:hAnsi="Times New Roman" w:cs="Times New Roman"/>
+          <w:b/>
           <w:color w:val="auto"/>
-          <w:sz w:val="36"/>
-          <w:szCs w:val="36"/>
-        </w:rPr>
-      </w:pPr>
-      <w:r>
-        <w:rPr>
-          <w:rFonts w:ascii="Calibri" w:eastAsia="Calibri" w:hAnsi="Calibri" w:cs="Calibri"/>
-          <w:b/>
-          <w:bCs/>
+          <w:sz w:val="22"/>
+          <w:szCs w:val="22"/>
+          <w:lang w:val="es-ES"/>
+        </w:rPr>
+      </w:pPr>
+      <w:r>
+        <w:rPr>
+          <w:rFonts w:ascii="Times New Roman" w:eastAsia="Arial" w:hAnsi="Times New Roman" w:cs="Times New Roman"/>
+          <w:b/>
           <w:color w:val="auto"/>
-          <w:sz w:val="36"/>
-          <w:szCs w:val="36"/>
-        </w:rPr>
-        <w:t>3. Integración del Sistema en el Flujo Principal (</w:t>
+          <w:sz w:val="22"/>
+          <w:szCs w:val="22"/>
+          <w:lang w:val="es-ES"/>
+        </w:rPr>
+        <w:t>Integración del Sistema en el Flujo Principal (</w:t>
       </w:r>
       <w:proofErr w:type="spellStart"/>
       <w:r>
         <w:rPr>
-          <w:rFonts w:ascii="Consolas" w:eastAsia="Consolas" w:hAnsi="Consolas" w:cs="Consolas"/>
-          <w:b/>
-          <w:bCs/>
+          <w:rFonts w:ascii="Times New Roman" w:eastAsia="Arial" w:hAnsi="Times New Roman" w:cs="Times New Roman"/>
+          <w:b/>
           <w:color w:val="auto"/>
-          <w:sz w:val="36"/>
-          <w:szCs w:val="36"/>
+          <w:sz w:val="22"/>
+          <w:szCs w:val="22"/>
+          <w:lang w:val="es-ES"/>
         </w:rPr>
         <w:t>main</w:t>
       </w:r>
       <w:proofErr w:type="spellEnd"/>
       <w:r>
         <w:rPr>
-          <w:rFonts w:ascii="Calibri" w:eastAsia="Calibri" w:hAnsi="Calibri" w:cs="Calibri"/>
-          <w:b/>
-          <w:bCs/>
+          <w:rFonts w:ascii="Times New Roman" w:eastAsia="Arial" w:hAnsi="Times New Roman" w:cs="Times New Roman"/>
+          <w:b/>
           <w:color w:val="auto"/>
-          <w:sz w:val="36"/>
-          <w:szCs w:val="36"/>
+          <w:sz w:val="22"/>
+          <w:szCs w:val="22"/>
+          <w:lang w:val="es-ES"/>
         </w:rPr>
         <w:t>)</w:t>
       </w:r>
     </w:p>
     <w:p>
       <w:pPr>
-        <w:spacing w:after="240" w:line="360" w:lineRule="auto"/>
-      </w:pPr>
-      <w:r>
-        <w:rPr>
-          <w:rFonts w:ascii="Calibri" w:eastAsia="Calibri" w:hAnsi="Calibri" w:cs="Calibri"/>
+        <w:spacing w:line="360" w:lineRule="auto"/>
+        <w:rPr>
+          <w:rFonts w:ascii="Times New Roman" w:hAnsi="Times New Roman" w:cs="Times New Roman"/>
+        </w:rPr>
+      </w:pPr>
+      <w:r>
+        <w:rPr>
+          <w:rFonts w:ascii="Times New Roman" w:eastAsia="Calibri" w:hAnsi="Times New Roman" w:cs="Times New Roman"/>
         </w:rPr>
         <w:t>El programa integra todas las funciones anteriores dentro de la rutina principal mediante un ciclo de tres fases claramente definidas:</w:t>
       </w:r>
@@ -3080,16 +3475,16 @@
           <w:ilvl w:val="0"/>
           <w:numId w:val="25"/>
         </w:numPr>
-        <w:spacing w:after="240" w:line="360" w:lineRule="auto"/>
-        <w:rPr>
-          <w:rFonts w:ascii="Calibri" w:eastAsia="Calibri" w:hAnsi="Calibri" w:cs="Calibri"/>
+        <w:spacing w:line="360" w:lineRule="auto"/>
+        <w:rPr>
+          <w:rFonts w:ascii="Times New Roman" w:eastAsia="Calibri" w:hAnsi="Times New Roman" w:cs="Times New Roman"/>
           <w:b/>
           <w:bCs/>
         </w:rPr>
       </w:pPr>
       <w:r>
         <w:rPr>
-          <w:rFonts w:ascii="Calibri" w:eastAsia="Calibri" w:hAnsi="Calibri" w:cs="Calibri"/>
+          <w:rFonts w:ascii="Times New Roman" w:eastAsia="Calibri" w:hAnsi="Times New Roman" w:cs="Times New Roman"/>
           <w:b/>
           <w:bCs/>
         </w:rPr>
@@ -3098,25 +3493,28 @@
     </w:p>
     <w:p>
       <w:pPr>
-        <w:spacing w:after="240" w:line="360" w:lineRule="auto"/>
-      </w:pPr>
-      <w:r>
-        <w:rPr>
-          <w:rFonts w:ascii="Calibri" w:eastAsia="Calibri" w:hAnsi="Calibri" w:cs="Calibri"/>
+        <w:spacing w:line="360" w:lineRule="auto"/>
+        <w:rPr>
+          <w:rFonts w:ascii="Times New Roman" w:hAnsi="Times New Roman" w:cs="Times New Roman"/>
+        </w:rPr>
+      </w:pPr>
+      <w:r>
+        <w:rPr>
+          <w:rFonts w:ascii="Times New Roman" w:eastAsia="Calibri" w:hAnsi="Times New Roman" w:cs="Times New Roman"/>
         </w:rPr>
         <w:t xml:space="preserve">El sistema solicita al usuario todos los parámetros de control: la posición inicial en </w:t>
       </w:r>
       <m:oMath>
         <m:r>
           <w:rPr>
-            <w:rFonts w:ascii="Cambria Math" w:hAnsi="Cambria Math"/>
+            <w:rFonts w:ascii="Cambria Math" w:hAnsi="Cambria Math" w:cs="Times New Roman"/>
           </w:rPr>
           <m:t>π</m:t>
         </m:r>
       </m:oMath>
       <w:r>
         <w:rPr>
-          <w:rFonts w:ascii="Calibri" w:eastAsia="Calibri" w:hAnsi="Calibri" w:cs="Calibri"/>
+          <w:rFonts w:ascii="Times New Roman" w:eastAsia="Calibri" w:hAnsi="Times New Roman" w:cs="Times New Roman"/>
         </w:rPr>
         <w:t xml:space="preserve"> (que actúa como semilla), el salto o distancia entre dígitos, la cantidad de bits a desplazar, el límite superior de los números generados y el total de muestras requeridas. Se establece un estado base inicial (por ejemplo, 67) para evitar que las operaciones matemáticas comiencen en cero.</w:t>
       </w:r>
@@ -3128,16 +3526,16 @@
           <w:ilvl w:val="0"/>
           <w:numId w:val="25"/>
         </w:numPr>
-        <w:spacing w:after="240" w:line="360" w:lineRule="auto"/>
-        <w:rPr>
-          <w:rFonts w:ascii="Calibri" w:eastAsia="Calibri" w:hAnsi="Calibri" w:cs="Calibri"/>
+        <w:spacing w:line="360" w:lineRule="auto"/>
+        <w:rPr>
+          <w:rFonts w:ascii="Times New Roman" w:eastAsia="Calibri" w:hAnsi="Times New Roman" w:cs="Times New Roman"/>
           <w:b/>
           <w:bCs/>
         </w:rPr>
       </w:pPr>
       <w:r>
         <w:rPr>
-          <w:rFonts w:ascii="Calibri" w:eastAsia="Calibri" w:hAnsi="Calibri" w:cs="Calibri"/>
+          <w:rFonts w:ascii="Times New Roman" w:eastAsia="Calibri" w:hAnsi="Times New Roman" w:cs="Times New Roman"/>
           <w:b/>
           <w:bCs/>
         </w:rPr>
@@ -3146,39 +3544,42 @@
     </w:p>
     <w:p>
       <w:pPr>
-        <w:spacing w:after="240" w:line="360" w:lineRule="auto"/>
-      </w:pPr>
-      <w:r>
-        <w:rPr>
-          <w:rFonts w:ascii="Calibri" w:eastAsia="Calibri" w:hAnsi="Calibri" w:cs="Calibri"/>
+        <w:spacing w:line="360" w:lineRule="auto"/>
+        <w:rPr>
+          <w:rFonts w:ascii="Times New Roman" w:hAnsi="Times New Roman" w:cs="Times New Roman"/>
+        </w:rPr>
+      </w:pPr>
+      <w:r>
+        <w:rPr>
+          <w:rFonts w:ascii="Times New Roman" w:eastAsia="Calibri" w:hAnsi="Times New Roman" w:cs="Times New Roman"/>
         </w:rPr>
         <w:t xml:space="preserve">Antes de emitir el primer número válido, el código ejecuta un ciclo de calentamiento (15 iteraciones). En este proceso, se avanza la posición en </w:t>
       </w:r>
       <m:oMath>
         <m:r>
           <w:rPr>
-            <w:rFonts w:ascii="Cambria Math" w:hAnsi="Cambria Math"/>
+            <w:rFonts w:ascii="Cambria Math" w:hAnsi="Cambria Math" w:cs="Times New Roman"/>
           </w:rPr>
           <m:t>π</m:t>
         </m:r>
       </m:oMath>
       <w:r>
         <w:rPr>
-          <w:rFonts w:ascii="Calibri" w:eastAsia="Calibri" w:hAnsi="Calibri" w:cs="Calibri"/>
+          <w:rFonts w:ascii="Times New Roman" w:eastAsia="Calibri" w:hAnsi="Times New Roman" w:cs="Times New Roman"/>
         </w:rPr>
         <w:t xml:space="preserve">, se extraen los dígitos y se mezclan iterativamente con el estado. Su objetivo es dar tiempo para que la entropía de los dígitos de </w:t>
       </w:r>
       <m:oMath>
         <m:r>
           <w:rPr>
-            <w:rFonts w:ascii="Cambria Math" w:hAnsi="Cambria Math"/>
+            <w:rFonts w:ascii="Cambria Math" w:hAnsi="Cambria Math" w:cs="Times New Roman"/>
           </w:rPr>
           <m:t>π</m:t>
         </m:r>
       </m:oMath>
       <w:r>
         <w:rPr>
-          <w:rFonts w:ascii="Calibri" w:eastAsia="Calibri" w:hAnsi="Calibri" w:cs="Calibri"/>
+          <w:rFonts w:ascii="Times New Roman" w:eastAsia="Calibri" w:hAnsi="Times New Roman" w:cs="Times New Roman"/>
         </w:rPr>
         <w:t xml:space="preserve"> se propague por todos los bits, eliminando cualquier sesgo inicial derivado de la semilla o del estado base.</w:t>
       </w:r>
@@ -3190,16 +3591,16 @@
           <w:ilvl w:val="0"/>
           <w:numId w:val="25"/>
         </w:numPr>
-        <w:spacing w:after="240" w:line="360" w:lineRule="auto"/>
-        <w:rPr>
-          <w:rFonts w:ascii="Calibri" w:eastAsia="Calibri" w:hAnsi="Calibri" w:cs="Calibri"/>
+        <w:spacing w:line="360" w:lineRule="auto"/>
+        <w:rPr>
+          <w:rFonts w:ascii="Times New Roman" w:eastAsia="Calibri" w:hAnsi="Times New Roman" w:cs="Times New Roman"/>
           <w:b/>
           <w:bCs/>
         </w:rPr>
       </w:pPr>
       <w:r>
         <w:rPr>
-          <w:rFonts w:ascii="Calibri" w:eastAsia="Calibri" w:hAnsi="Calibri" w:cs="Calibri"/>
+          <w:rFonts w:ascii="Times New Roman" w:eastAsia="Calibri" w:hAnsi="Times New Roman" w:cs="Times New Roman"/>
           <w:b/>
           <w:bCs/>
         </w:rPr>
@@ -3208,12 +3609,16 @@
     </w:p>
     <w:p>
       <w:pPr>
-        <w:spacing w:after="240" w:line="360" w:lineRule="auto"/>
-      </w:pPr>
-      <w:r>
-        <w:rPr>
-          <w:rFonts w:ascii="Calibri" w:eastAsia="Calibri" w:hAnsi="Calibri" w:cs="Calibri"/>
-        </w:rPr>
+        <w:spacing w:line="360" w:lineRule="auto"/>
+        <w:rPr>
+          <w:rFonts w:ascii="Times New Roman" w:hAnsi="Times New Roman" w:cs="Times New Roman"/>
+        </w:rPr>
+      </w:pPr>
+      <w:r>
+        <w:rPr>
+          <w:rFonts w:ascii="Times New Roman" w:eastAsia="Calibri" w:hAnsi="Times New Roman" w:cs="Times New Roman"/>
+        </w:rPr>
+        <w:lastRenderedPageBreak/>
         <w:t>Una vez estabilizado el estado, el sistema entra en el bucle final. Por cada iteración solicitada por el usuario:</w:t>
       </w:r>
     </w:p>
@@ -3224,28 +3629,28 @@
           <w:ilvl w:val="1"/>
           <w:numId w:val="25"/>
         </w:numPr>
-        <w:spacing w:after="240" w:line="360" w:lineRule="auto"/>
-        <w:rPr>
-          <w:rFonts w:ascii="Calibri" w:eastAsia="Calibri" w:hAnsi="Calibri" w:cs="Calibri"/>
-        </w:rPr>
-      </w:pPr>
-      <w:r>
-        <w:rPr>
-          <w:rFonts w:ascii="Calibri" w:eastAsia="Calibri" w:hAnsi="Calibri" w:cs="Calibri"/>
+        <w:spacing w:line="360" w:lineRule="auto"/>
+        <w:rPr>
+          <w:rFonts w:ascii="Times New Roman" w:eastAsia="Calibri" w:hAnsi="Times New Roman" w:cs="Times New Roman"/>
+        </w:rPr>
+      </w:pPr>
+      <w:r>
+        <w:rPr>
+          <w:rFonts w:ascii="Times New Roman" w:eastAsia="Calibri" w:hAnsi="Times New Roman" w:cs="Times New Roman"/>
         </w:rPr>
         <w:t xml:space="preserve">Calcula la nueva posición en </w:t>
       </w:r>
       <m:oMath>
         <m:r>
           <w:rPr>
-            <w:rFonts w:ascii="Cambria Math" w:hAnsi="Cambria Math"/>
+            <w:rFonts w:ascii="Cambria Math" w:hAnsi="Cambria Math" w:cs="Times New Roman"/>
           </w:rPr>
           <m:t>π</m:t>
         </m:r>
       </m:oMath>
       <w:r>
         <w:rPr>
-          <w:rFonts w:ascii="Calibri" w:eastAsia="Calibri" w:hAnsi="Calibri" w:cs="Calibri"/>
+          <w:rFonts w:ascii="Times New Roman" w:eastAsia="Calibri" w:hAnsi="Times New Roman" w:cs="Times New Roman"/>
         </w:rPr>
         <w:t xml:space="preserve"> sumando el valor del salto.</w:t>
       </w:r>
@@ -3257,28 +3662,28 @@
           <w:ilvl w:val="1"/>
           <w:numId w:val="25"/>
         </w:numPr>
-        <w:spacing w:after="240" w:line="360" w:lineRule="auto"/>
-        <w:rPr>
-          <w:rFonts w:ascii="Calibri" w:eastAsia="Calibri" w:hAnsi="Calibri" w:cs="Calibri"/>
-        </w:rPr>
-      </w:pPr>
-      <w:r>
-        <w:rPr>
-          <w:rFonts w:ascii="Calibri" w:eastAsia="Calibri" w:hAnsi="Calibri" w:cs="Calibri"/>
+        <w:spacing w:line="360" w:lineRule="auto"/>
+        <w:rPr>
+          <w:rFonts w:ascii="Times New Roman" w:eastAsia="Calibri" w:hAnsi="Times New Roman" w:cs="Times New Roman"/>
+        </w:rPr>
+      </w:pPr>
+      <w:r>
+        <w:rPr>
+          <w:rFonts w:ascii="Times New Roman" w:eastAsia="Calibri" w:hAnsi="Times New Roman" w:cs="Times New Roman"/>
         </w:rPr>
         <w:t xml:space="preserve">Invoca </w:t>
       </w:r>
       <w:proofErr w:type="spellStart"/>
       <w:r>
         <w:rPr>
-          <w:rFonts w:ascii="Consolas" w:eastAsia="Consolas" w:hAnsi="Consolas" w:cs="Consolas"/>
+          <w:rFonts w:ascii="Times New Roman" w:eastAsia="Consolas" w:hAnsi="Times New Roman" w:cs="Times New Roman"/>
         </w:rPr>
         <w:t>obtenerDigitoPi</w:t>
       </w:r>
       <w:proofErr w:type="spellEnd"/>
       <w:r>
         <w:rPr>
-          <w:rFonts w:ascii="Calibri" w:eastAsia="Calibri" w:hAnsi="Calibri" w:cs="Calibri"/>
+          <w:rFonts w:ascii="Times New Roman" w:eastAsia="Calibri" w:hAnsi="Times New Roman" w:cs="Times New Roman"/>
         </w:rPr>
         <w:t xml:space="preserve"> para capturar un nuevo fragmento de entropía.</w:t>
       </w:r>
@@ -3290,28 +3695,28 @@
           <w:ilvl w:val="1"/>
           <w:numId w:val="25"/>
         </w:numPr>
-        <w:spacing w:after="240" w:line="360" w:lineRule="auto"/>
-        <w:rPr>
-          <w:rFonts w:ascii="Calibri" w:eastAsia="Calibri" w:hAnsi="Calibri" w:cs="Calibri"/>
-        </w:rPr>
-      </w:pPr>
-      <w:r>
-        <w:rPr>
-          <w:rFonts w:ascii="Calibri" w:eastAsia="Calibri" w:hAnsi="Calibri" w:cs="Calibri"/>
+        <w:spacing w:line="360" w:lineRule="auto"/>
+        <w:rPr>
+          <w:rFonts w:ascii="Times New Roman" w:eastAsia="Calibri" w:hAnsi="Times New Roman" w:cs="Times New Roman"/>
+        </w:rPr>
+      </w:pPr>
+      <w:r>
+        <w:rPr>
+          <w:rFonts w:ascii="Times New Roman" w:eastAsia="Calibri" w:hAnsi="Times New Roman" w:cs="Times New Roman"/>
         </w:rPr>
         <w:t xml:space="preserve">Actualiza y corrompe el estado interno mediante la función </w:t>
       </w:r>
       <w:proofErr w:type="spellStart"/>
       <w:r>
         <w:rPr>
-          <w:rFonts w:ascii="Consolas" w:eastAsia="Consolas" w:hAnsi="Consolas" w:cs="Consolas"/>
+          <w:rFonts w:ascii="Times New Roman" w:eastAsia="Consolas" w:hAnsi="Times New Roman" w:cs="Times New Roman"/>
         </w:rPr>
         <w:t>mezclarEstado</w:t>
       </w:r>
       <w:proofErr w:type="spellEnd"/>
       <w:r>
         <w:rPr>
-          <w:rFonts w:ascii="Calibri" w:eastAsia="Calibri" w:hAnsi="Calibri" w:cs="Calibri"/>
+          <w:rFonts w:ascii="Times New Roman" w:eastAsia="Calibri" w:hAnsi="Times New Roman" w:cs="Times New Roman"/>
         </w:rPr>
         <w:t>.</w:t>
       </w:r>
@@ -3323,71 +3728,33 @@
           <w:ilvl w:val="1"/>
           <w:numId w:val="25"/>
         </w:numPr>
-        <w:spacing w:after="240" w:line="360" w:lineRule="auto"/>
-        <w:rPr>
-          <w:rFonts w:ascii="Calibri" w:eastAsia="Calibri" w:hAnsi="Calibri" w:cs="Calibri"/>
-        </w:rPr>
-      </w:pPr>
-      <w:r>
-        <w:rPr>
-          <w:rFonts w:ascii="Calibri" w:eastAsia="Calibri" w:hAnsi="Calibri" w:cs="Calibri"/>
+        <w:spacing w:line="360" w:lineRule="auto"/>
+        <w:rPr>
+          <w:rFonts w:ascii="Times New Roman" w:eastAsia="Arial" w:hAnsi="Times New Roman" w:cs="Times New Roman"/>
+          <w:b/>
+          <w:lang w:val="es-ES"/>
+        </w:rPr>
+      </w:pPr>
+      <w:r>
+        <w:rPr>
+          <w:rFonts w:ascii="Times New Roman" w:eastAsia="Calibri" w:hAnsi="Times New Roman" w:cs="Times New Roman"/>
         </w:rPr>
         <w:t xml:space="preserve">Ajusta el resultado final con </w:t>
       </w:r>
       <w:proofErr w:type="spellStart"/>
       <w:r>
         <w:rPr>
-          <w:rFonts w:ascii="Consolas" w:eastAsia="Consolas" w:hAnsi="Consolas" w:cs="Consolas"/>
+          <w:rFonts w:ascii="Times New Roman" w:eastAsia="Consolas" w:hAnsi="Times New Roman" w:cs="Times New Roman"/>
         </w:rPr>
         <w:t>aplicarLimite</w:t>
       </w:r>
       <w:proofErr w:type="spellEnd"/>
       <w:r>
         <w:rPr>
-          <w:rFonts w:ascii="Calibri" w:eastAsia="Calibri" w:hAnsi="Calibri" w:cs="Calibri"/>
+          <w:rFonts w:ascii="Times New Roman" w:eastAsia="Calibri" w:hAnsi="Times New Roman" w:cs="Times New Roman"/>
         </w:rPr>
         <w:t xml:space="preserve"> y lo imprime en pantalla para el usuario.</w:t>
       </w:r>
-    </w:p>
-    <w:p/>
-    <w:p>
-      <w:pPr>
-        <w:spacing w:after="240" w:line="360" w:lineRule="auto"/>
-        <w:rPr>
-          <w:rFonts w:ascii="Calibri" w:eastAsia="Calibri" w:hAnsi="Calibri" w:cs="Calibri"/>
-        </w:rPr>
-      </w:pPr>
-    </w:p>
-    <w:p>
-      <w:pPr>
-        <w:spacing w:after="240" w:line="360" w:lineRule="auto"/>
-        <w:rPr>
-          <w:rFonts w:ascii="Calibri" w:eastAsia="Calibri" w:hAnsi="Calibri" w:cs="Calibri"/>
-        </w:rPr>
-      </w:pPr>
-    </w:p>
-    <w:p>
-      <w:pPr>
-        <w:spacing w:line="360" w:lineRule="auto"/>
-        <w:rPr>
-          <w:rFonts w:ascii="Times New Roman" w:eastAsia="Times New Roman" w:hAnsi="Times New Roman" w:cs="Times New Roman"/>
-          <w:b/>
-          <w:bCs/>
-          <w:i/>
-          <w:iCs/>
-          <w:lang w:val="es-ES"/>
-        </w:rPr>
-      </w:pPr>
-    </w:p>
-    <w:p>
-      <w:pPr>
-        <w:spacing w:line="360" w:lineRule="auto"/>
-        <w:rPr>
-          <w:rFonts w:ascii="Times New Roman" w:eastAsia="Arial" w:hAnsi="Times New Roman" w:cs="Times New Roman"/>
-          <w:b/>
-          <w:lang w:val="es-ES"/>
-        </w:rPr>
-      </w:pPr>
       <w:r>
         <w:rPr>
           <w:rFonts w:ascii="Times New Roman" w:eastAsia="Arial" w:hAnsi="Times New Roman" w:cs="Times New Roman"/>
@@ -3434,6 +3801,7 @@
       <w:pPr>
         <w:spacing w:line="360" w:lineRule="auto"/>
         <w:rPr>
+          <w:rFonts w:ascii="Times New Roman" w:hAnsi="Times New Roman" w:cs="Times New Roman"/>
           <w:lang w:val="es-ES"/>
         </w:rPr>
       </w:pPr>
@@ -6334,6 +6702,7 @@
       <w:pPr>
         <w:spacing w:line="360" w:lineRule="auto"/>
         <w:rPr>
+          <w:rFonts w:ascii="Times New Roman" w:hAnsi="Times New Roman" w:cs="Times New Roman"/>
           <w:lang w:val="es-ES"/>
         </w:rPr>
       </w:pPr>
@@ -6610,7 +6979,6 @@
         <w:docPartUnique/>
       </w:docPartObj>
     </w:sdtPr>
-    <w:sdtEndPr/>
     <w:sdtContent>
       <w:p>
         <w:pPr>
@@ -6690,7 +7058,6 @@
         <w:docPartUnique/>
       </w:docPartObj>
     </w:sdtPr>
-    <w:sdtEndPr/>
     <w:sdtContent>
       <w:p>
         <w:pPr>

</xml_diff>